<commit_message>
Ch01: basics-first tone, plain language, bookmark navigation
- Lead with sit, come, walk nicely; permission to stop at basics
- Replace jargon in §2 with plain teaching habit and five questions
- Add bookmark table in §4; cookbook use encouraged
- VOICE_BRIEF: basics-first and bookmarking; sync review slice DOCX

Co-authored-by: GeneralKnowledge <GeneralKnowledge@users.noreply.github.com>
</commit_message>
<xml_diff>
--- a/export/review-slices/Good-Dog-Ch01-Trainer-Review-Slice-v2.docx
+++ b/export/review-slices/Good-Dog-Ch01-Trainer-Review-Slice-v2.docx
@@ -100,28 +100,6 @@
       <w:r>
         <w:t xml:space="preserve"> </w:t>
       </w:r>
-      <w:r>
-        <w:t xml:space="preserve">introduces</w:t>
-      </w:r>
-      <w:r>
-        <w:t xml:space="preserve"> </w:t>
-      </w:r>
-      <w:r>
-        <w:rPr>
-          <w:bCs/>
-          <w:b/>
-        </w:rPr>
-        <w:t xml:space="preserve">Training the Human</w:t>
-      </w:r>
-      <w:r>
-        <w:t xml:space="preserve"> </w:t>
-      </w:r>
-      <w:r>
-        <w:t xml:space="preserve">as one integrated system (not a pamphlet).</w:t>
-      </w:r>
-      <w:r>
-        <w:t xml:space="preserve"> </w:t>
-      </w:r>
       <w:hyperlink r:id="rId21">
         <w:r>
           <w:rPr>
@@ -134,23 +112,23 @@
         <w:t xml:space="preserve"> </w:t>
       </w:r>
       <w:r>
-        <w:t xml:space="preserve">—</w:t>
-      </w:r>
-      <w:r>
-        <w:t xml:space="preserve"> </w:t>
-      </w:r>
-      <w:r>
-        <w:rPr>
-          <w:bCs/>
-          <w:b/>
-        </w:rPr>
-        <w:t xml:space="preserve">system intro</w:t>
-      </w:r>
-      <w:r>
-        <w:t xml:space="preserve"> </w:t>
-      </w:r>
-      <w:r>
-        <w:t xml:space="preserve">(Training the Human concept + casual tone, deferred loop/check names, leisure vs training walk preview).</w:t>
+        <w:t xml:space="preserve">— basics-first (sit, come, walk nicely), plain-language system,</w:t>
+      </w:r>
+      <w:r>
+        <w:t xml:space="preserve"> </w:t>
+      </w:r>
+      <w:r>
+        <w:rPr>
+          <w:bCs/>
+          <w:b/>
+        </w:rPr>
+        <w:t xml:space="preserve">bookmark table</w:t>
+      </w:r>
+      <w:r>
+        <w:t xml:space="preserve"> </w:t>
+      </w:r>
+      <w:r>
+        <w:t xml:space="preserve">in §4.</w:t>
       </w:r>
     </w:p>
     <w:bookmarkStart w:id="23" w:name="what-we-are-asking-you-to-review"/>
@@ -270,13 +248,13 @@
           <w:bCs/>
           <w:b/>
         </w:rPr>
-        <w:t xml:space="preserve">Read order:</w:t>
-      </w:r>
-      <w:r>
-        <w:t xml:space="preserve"> </w:t>
-      </w:r>
-      <w:r>
-        <w:t xml:space="preserve">ch12 (stress) before Part III live skills — one paragraph in ch01 §6.</w:t>
+        <w:t xml:space="preserve">Basics-first:</w:t>
+      </w:r>
+      <w:r>
+        <w:t xml:space="preserve"> </w:t>
+      </w:r>
+      <w:r>
+        <w:t xml:space="preserve">readers encouraged to stop at sit / come / walk nicely and bookmark chapters.</w:t>
       </w:r>
       <w:r>
         <w:br/>
@@ -295,49 +273,13 @@
           <w:bCs/>
           <w:b/>
         </w:rPr>
-        <w:t xml:space="preserve">Mantras:</w:t>
-      </w:r>
-      <w:r>
-        <w:t xml:space="preserve"> </w:t>
-      </w:r>
-      <w:r>
-        <w:rPr>
-          <w:iCs/>
-          <w:i/>
-        </w:rPr>
-        <w:t xml:space="preserve">Make it easier — then ask again.</w:t>
-      </w:r>
-      <w:r>
-        <w:t xml:space="preserve">,</w:t>
-      </w:r>
-      <w:r>
-        <w:t xml:space="preserve"> </w:t>
-      </w:r>
-      <w:r>
-        <w:rPr>
-          <w:iCs/>
-          <w:i/>
-        </w:rPr>
-        <w:t xml:space="preserve">Train the human first</w:t>
-      </w:r>
-      <w:r>
-        <w:t xml:space="preserve">,</w:t>
-      </w:r>
-      <w:r>
-        <w:t xml:space="preserve"> </w:t>
-      </w:r>
-      <w:r>
-        <w:rPr>
-          <w:iCs/>
-          <w:i/>
-        </w:rPr>
-        <w:t xml:space="preserve">Good human.</w:t>
-      </w:r>
-      <w:r>
-        <w:t xml:space="preserve"> </w:t>
-      </w:r>
-      <w:r>
-        <w:t xml:space="preserve">— repeated on purpose in ch01 and across the book.</w:t>
+        <w:t xml:space="preserve">Plain language:</w:t>
+      </w:r>
+      <w:r>
+        <w:t xml:space="preserve"> </w:t>
+      </w:r>
+      <w:r>
+        <w:t xml:space="preserve">ch01 avoids jargon where possible (maps to loop/checks/dual-track in later chapters).</w:t>
       </w:r>
       <w:r>
         <w:br/>
@@ -356,13 +298,13 @@
           <w:bCs/>
           <w:b/>
         </w:rPr>
-        <w:t xml:space="preserve">Place ladder:</w:t>
-      </w:r>
-      <w:r>
-        <w:t xml:space="preserve"> </w:t>
-      </w:r>
-      <w:r>
-        <w:t xml:space="preserve">house → garden → outside (introduced in ch01 §2).</w:t>
+        <w:t xml:space="preserve">Bookmarks:</w:t>
+      </w:r>
+      <w:r>
+        <w:t xml:space="preserve"> </w:t>
+      </w:r>
+      <w:r>
+        <w:t xml:space="preserve">§4 table points to ch7–14 by need.</w:t>
       </w:r>
       <w:r>
         <w:br/>
@@ -381,85 +323,43 @@
           <w:bCs/>
           <w:b/>
         </w:rPr>
-        <w:t xml:space="preserve">Walks:</w:t>
-      </w:r>
-      <w:r>
-        <w:t xml:space="preserve"> </w:t>
-      </w:r>
-      <w:r>
-        <w:t xml:space="preserve">ch01 §4 splits</w:t>
-      </w:r>
-      <w:r>
-        <w:t xml:space="preserve"> </w:t>
-      </w:r>
-      <w:r>
-        <w:rPr>
-          <w:bCs/>
-          <w:b/>
-        </w:rPr>
-        <w:t xml:space="preserve">leisure walk</w:t>
-      </w:r>
-      <w:r>
-        <w:t xml:space="preserve"> </w:t>
-      </w:r>
-      <w:r>
-        <w:t xml:space="preserve">vs</w:t>
-      </w:r>
-      <w:r>
-        <w:t xml:space="preserve"> </w:t>
-      </w:r>
-      <w:r>
-        <w:rPr>
-          <w:bCs/>
-          <w:b/>
-        </w:rPr>
-        <w:t xml:space="preserve">training walk</w:t>
-      </w:r>
-      <w:r>
-        <w:t xml:space="preserve">; loose-lead teaching is deferred to ch10.</w:t>
-      </w:r>
-      <w:r>
-        <w:br/>
-      </w:r>
-    </w:p>
-    <w:p>
-      <w:pPr>
-        <w:numPr>
-          <w:ilvl w:val="0"/>
-          <w:numId w:val="1001"/>
-        </w:numPr>
-        <w:pStyle w:val="Compact"/>
-      </w:pPr>
-      <w:r>
-        <w:rPr>
-          <w:bCs/>
-          <w:b/>
-        </w:rPr>
-        <w:t xml:space="preserve">ch14</w:t>
-      </w:r>
-      <w:r>
-        <w:t xml:space="preserve"> </w:t>
-      </w:r>
-      <w:r>
-        <w:t xml:space="preserve">holds the fuller</w:t>
-      </w:r>
-      <w:r>
-        <w:t xml:space="preserve"> </w:t>
-      </w:r>
-      <w:r>
-        <w:t xml:space="preserve">“</w:t>
-      </w:r>
-      <w:r>
-        <w:t xml:space="preserve">if you are worried</w:t>
-      </w:r>
-      <w:r>
-        <w:t xml:space="preserve">”</w:t>
-      </w:r>
-      <w:r>
-        <w:t xml:space="preserve"> </w:t>
-      </w:r>
-      <w:r>
-        <w:t xml:space="preserve">navigation.</w:t>
+        <w:t xml:space="preserve">Mantras:</w:t>
+      </w:r>
+      <w:r>
+        <w:t xml:space="preserve"> </w:t>
+      </w:r>
+      <w:r>
+        <w:rPr>
+          <w:iCs/>
+          <w:i/>
+        </w:rPr>
+        <w:t xml:space="preserve">Make it easier — then ask again.</w:t>
+      </w:r>
+      <w:r>
+        <w:t xml:space="preserve">,</w:t>
+      </w:r>
+      <w:r>
+        <w:t xml:space="preserve"> </w:t>
+      </w:r>
+      <w:r>
+        <w:rPr>
+          <w:iCs/>
+          <w:i/>
+        </w:rPr>
+        <w:t xml:space="preserve">Train the human first</w:t>
+      </w:r>
+      <w:r>
+        <w:t xml:space="preserve">,</w:t>
+      </w:r>
+      <w:r>
+        <w:t xml:space="preserve"> </w:t>
+      </w:r>
+      <w:r>
+        <w:rPr>
+          <w:iCs/>
+          <w:i/>
+        </w:rPr>
+        <w:t xml:space="preserve">Good human.</w:t>
       </w:r>
     </w:p>
     <w:bookmarkEnd w:id="24"/>
@@ -574,7 +474,7 @@
         <w:t xml:space="preserve"> </w:t>
       </w:r>
       <w:r>
-        <w:t xml:space="preserve">for pet owners at E2/public-guidance level (reward-based default, manage vs train vs vet vs behaviourist split)?</w:t>
+        <w:t xml:space="preserve">for pet owners at E2/public-guidance level?</w:t>
       </w:r>
       <w:r>
         <w:br/>
@@ -631,7 +531,7 @@
         <w:t xml:space="preserve"> </w:t>
       </w:r>
       <w:r>
-        <w:t xml:space="preserve">language you would insist on in an intro chapter?</w:t>
+        <w:t xml:space="preserve">language?</w:t>
       </w:r>
       <w:r>
         <w:br/>
@@ -650,29 +550,28 @@
           <w:bCs/>
           <w:b/>
         </w:rPr>
-        <w:t xml:space="preserve">Trainer audience:</w:t>
-      </w:r>
-      <w:r>
-        <w:t xml:space="preserve"> </w:t>
-      </w:r>
-      <w:r>
-        <w:t xml:space="preserve">What would make a professional</w:t>
-      </w:r>
-      <w:r>
-        <w:t xml:space="preserve"> </w:t>
-      </w:r>
-      <w:r>
-        <w:rPr>
-          <w:bCs/>
-          <w:b/>
-        </w:rPr>
-        <w:t xml:space="preserve">cringe</w:t>
-      </w:r>
-      <w:r>
-        <w:t xml:space="preserve"> </w:t>
-      </w:r>
-      <w:r>
-        <w:t xml:space="preserve">or lose trust — and what would earn trust?</w:t>
+        <w:t xml:space="preserve">Basics-first tone:</w:t>
+      </w:r>
+      <w:r>
+        <w:t xml:space="preserve"> </w:t>
+      </w:r>
+      <w:r>
+        <w:t xml:space="preserve">Does ch01 feel welcoming for</w:t>
+      </w:r>
+      <w:r>
+        <w:t xml:space="preserve"> </w:t>
+      </w:r>
+      <w:r>
+        <w:t xml:space="preserve">“</w:t>
+      </w:r>
+      <w:r>
+        <w:t xml:space="preserve">I just want sit, come, walk nicely</w:t>
+      </w:r>
+      <w:r>
+        <w:t xml:space="preserve">”</w:t>
+      </w:r>
+      <w:r>
+        <w:t xml:space="preserve">?</w:t>
       </w:r>
       <w:r>
         <w:br/>
@@ -691,31 +590,13 @@
           <w:bCs/>
           <w:b/>
         </w:rPr>
-        <w:t xml:space="preserve">Owner frustration / owner stress:</w:t>
-      </w:r>
-      <w:r>
-        <w:t xml:space="preserve"> </w:t>
-      </w:r>
-      <w:r>
-        <w:t xml:space="preserve">The</w:t>
-      </w:r>
-      <w:r>
-        <w:t xml:space="preserve"> </w:t>
-      </w:r>
-      <w:r>
-        <w:t xml:space="preserve">“</w:t>
-      </w:r>
-      <w:r>
-        <w:t xml:space="preserve">what messes dogs up (usually us)</w:t>
-      </w:r>
-      <w:r>
-        <w:t xml:space="preserve">”</w:t>
-      </w:r>
-      <w:r>
-        <w:t xml:space="preserve"> </w:t>
-      </w:r>
-      <w:r>
-        <w:t xml:space="preserve">beat — fair and useful, or off?</w:t>
+        <w:t xml:space="preserve">Jargon level:</w:t>
+      </w:r>
+      <w:r>
+        <w:t xml:space="preserve"> </w:t>
+      </w:r>
+      <w:r>
+        <w:t xml:space="preserve">Still too much machinery in §2, or about right for a system intro?</w:t>
       </w:r>
       <w:r>
         <w:br/>
@@ -734,29 +615,13 @@
           <w:bCs/>
           <w:b/>
         </w:rPr>
-        <w:t xml:space="preserve">Dual track (Train yourself / Train the dog):</w:t>
-      </w:r>
-      <w:r>
-        <w:t xml:space="preserve"> </w:t>
-      </w:r>
-      <w:r>
-        <w:t xml:space="preserve">Clear enough? Are Know/Do/Don’t sentences</w:t>
-      </w:r>
-      <w:r>
-        <w:t xml:space="preserve"> </w:t>
-      </w:r>
-      <w:r>
-        <w:rPr>
-          <w:bCs/>
-          <w:b/>
-        </w:rPr>
-        <w:t xml:space="preserve">plain enough</w:t>
-      </w:r>
-      <w:r>
-        <w:t xml:space="preserve"> </w:t>
-      </w:r>
-      <w:r>
-        <w:t xml:space="preserve">(we removed semicolon chains for dyslexia-friendly reading)?</w:t>
+        <w:t xml:space="preserve">Bookmarks:</w:t>
+      </w:r>
+      <w:r>
+        <w:t xml:space="preserve"> </w:t>
+      </w:r>
+      <w:r>
+        <w:t xml:space="preserve">Useful for real owners, or clutter?</w:t>
       </w:r>
       <w:r>
         <w:br/>
@@ -775,13 +640,13 @@
           <w:bCs/>
           <w:b/>
         </w:rPr>
-        <w:t xml:space="preserve">Leisure vs training walk:</w:t>
-      </w:r>
-      <w:r>
-        <w:t xml:space="preserve"> </w:t>
-      </w:r>
-      <w:r>
-        <w:t xml:space="preserve">Does the split make sense before ch10?</w:t>
+        <w:t xml:space="preserve">Trainer audience:</w:t>
+      </w:r>
+      <w:r>
+        <w:t xml:space="preserve"> </w:t>
+      </w:r>
+      <w:r>
+        <w:t xml:space="preserve">Cringe or trust?</w:t>
       </w:r>
       <w:r>
         <w:br/>
@@ -800,38 +665,13 @@
           <w:bCs/>
           <w:b/>
         </w:rPr>
-        <w:t xml:space="preserve">Mantra repetition in ch01:</w:t>
-      </w:r>
-      <w:r>
-        <w:t xml:space="preserve"> </w:t>
-      </w:r>
-      <w:r>
-        <w:t xml:space="preserve">Too much, or about right for a foundation chapter?</w:t>
-      </w:r>
-      <w:r>
-        <w:br/>
-      </w:r>
-    </w:p>
-    <w:p>
-      <w:pPr>
-        <w:numPr>
-          <w:ilvl w:val="0"/>
-          <w:numId w:val="1003"/>
-        </w:numPr>
-        <w:pStyle w:val="Compact"/>
-      </w:pPr>
-      <w:r>
-        <w:rPr>
-          <w:bCs/>
-          <w:b/>
-        </w:rPr>
         <w:t xml:space="preserve">Gaps:</w:t>
       </w:r>
       <w:r>
         <w:t xml:space="preserve"> </w:t>
       </w:r>
       <w:r>
-        <w:t xml:space="preserve">One thing you would</w:t>
+        <w:t xml:space="preserve">One</w:t>
       </w:r>
       <w:r>
         <w:t xml:space="preserve"> </w:t>
@@ -925,7 +765,7 @@
         <w:pStyle w:val="Compact"/>
       </w:pPr>
       <w:r>
-        <w:t xml:space="preserve">Your credentials and scope (e.g. ABTC, IMDT, vet nurse, behaviourist) — for our register only, not for marketing unless you agree separately.</w:t>
+        <w:t xml:space="preserve">Your credentials and scope — for our register only, not for marketing unless you agree separately.</w:t>
       </w:r>
     </w:p>
     <w:bookmarkEnd w:id="27"/>
@@ -1031,7 +871,46 @@
         <w:pStyle w:val="FirstParagraph"/>
       </w:pPr>
       <w:r>
-        <w:t xml:space="preserve">You bought the book, or borrowed it from someone who owns a dog and opinions. Fair enough. Before we talk about sits, recalls, or the mysterious art of not being dragged into a bush, we need a deal — not with me, with</w:t>
+        <w:t xml:space="preserve">You bought the book, or borrowed it from someone who owns a dog and opinions. Fair enough. Before we talk about</w:t>
+      </w:r>
+      <w:r>
+        <w:t xml:space="preserve"> </w:t>
+      </w:r>
+      <w:r>
+        <w:rPr>
+          <w:bCs/>
+          <w:b/>
+        </w:rPr>
+        <w:t xml:space="preserve">sit</w:t>
+      </w:r>
+      <w:r>
+        <w:t xml:space="preserve">,</w:t>
+      </w:r>
+      <w:r>
+        <w:t xml:space="preserve"> </w:t>
+      </w:r>
+      <w:r>
+        <w:rPr>
+          <w:bCs/>
+          <w:b/>
+        </w:rPr>
+        <w:t xml:space="preserve">come</w:t>
+      </w:r>
+      <w:r>
+        <w:t xml:space="preserve">, and</w:t>
+      </w:r>
+      <w:r>
+        <w:t xml:space="preserve"> </w:t>
+      </w:r>
+      <w:r>
+        <w:rPr>
+          <w:bCs/>
+          <w:b/>
+        </w:rPr>
+        <w:t xml:space="preserve">walking nicely without yanking your arm off</w:t>
+      </w:r>
+      <w:r>
+        <w:t xml:space="preserve">, we need a deal — not with me, with</w:t>
       </w:r>
       <w:r>
         <w:t xml:space="preserve"> </w:t>
@@ -1052,17 +931,38 @@
         <w:pStyle w:val="BodyText"/>
       </w:pPr>
       <w:r>
-        <w:t xml:space="preserve">This chapter is not a pamphlet of hot tips. It introduces</w:t>
-      </w:r>
-      <w:r>
-        <w:t xml:space="preserve"> </w:t>
-      </w:r>
-      <w:r>
-        <w:rPr>
-          <w:bCs/>
-          <w:b/>
-        </w:rPr>
-        <w:t xml:space="preserve">one system</w:t>
+        <w:t xml:space="preserve">Most people want the</w:t>
+      </w:r>
+      <w:r>
+        <w:t xml:space="preserve"> </w:t>
+      </w:r>
+      <w:r>
+        <w:rPr>
+          <w:bCs/>
+          <w:b/>
+        </w:rPr>
+        <w:t xml:space="preserve">basics</w:t>
+      </w:r>
+      <w:r>
+        <w:t xml:space="preserve">, done kindly. Not a circus dog. Not internet perfection. If your dog sits when it helps, comes back most of the time, and walks without daily tug-of-war, you are already winning by real-life standards. This book is for you.</w:t>
+      </w:r>
+    </w:p>
+    <w:p>
+      <w:pPr>
+        <w:pStyle w:val="BodyText"/>
+      </w:pPr>
+      <w:r>
+        <w:t xml:space="preserve">It is not a pamphlet of hot tips. It is</w:t>
+      </w:r>
+      <w:r>
+        <w:t xml:space="preserve"> </w:t>
+      </w:r>
+      <w:r>
+        <w:rPr>
+          <w:bCs/>
+          <w:b/>
+        </w:rPr>
+        <w:t xml:space="preserve">one way of working</w:t>
       </w:r>
       <w:r>
         <w:t xml:space="preserve"> </w:t>
@@ -1084,7 +984,7 @@
         <w:t xml:space="preserve"> </w:t>
       </w:r>
       <w:r>
-        <w:t xml:space="preserve">— that runs through the whole book. Same parts, different skills. If that sounds like self-help wearing a lead clip, good. That is partly the point.</w:t>
+        <w:t xml:space="preserve">— that runs through the whole book. Same habits, different skills. If that sounds like self-help wearing a lead clip, good. That is partly the point.</w:t>
       </w:r>
     </w:p>
     <w:bookmarkEnd w:id="32"/>
@@ -1145,7 +1045,7 @@
         <w:t xml:space="preserve">Good dog</w:t>
       </w:r>
       <w:r>
-        <w:t xml:space="preserve">, for our purposes, means a dog who can live safely and happily with ordinary humans: clear expectations, kind teaching, management when teaching is not the right tool, and help when something hurts or scares them.</w:t>
+        <w:t xml:space="preserve">, for our purposes, means a dog you can live with safely and happily: clear rules, kind teaching, sensible shortcuts when teaching is not the right tool today, and help when something hurts or scares them.</w:t>
       </w:r>
     </w:p>
     <w:p>
@@ -1171,7 +1071,7 @@
         <w:t xml:space="preserve"> </w:t>
       </w:r>
       <w:r>
-        <w:t xml:space="preserve">In the park, good might mean</w:t>
+        <w:t xml:space="preserve">On a walk, good might mean</w:t>
       </w:r>
       <w:r>
         <w:t xml:space="preserve"> </w:t>
@@ -1180,7 +1080,7 @@
         <w:t xml:space="preserve">“</w:t>
       </w:r>
       <w:r>
-        <w:t xml:space="preserve">you can be a dog — sniff, trot, be weird — and still come back when it matters.</w:t>
+        <w:t xml:space="preserve">sniff, trot, be a dog — and come back when I call.</w:t>
       </w:r>
       <w:r>
         <w:t xml:space="preserve">”</w:t>
@@ -1197,41 +1097,23 @@
         <w:pStyle w:val="BodyText"/>
       </w:pPr>
       <w:r>
-        <w:t xml:space="preserve">UK guidance treats</w:t>
-      </w:r>
-      <w:r>
-        <w:t xml:space="preserve"> </w:t>
-      </w:r>
-      <w:r>
-        <w:rPr>
-          <w:bCs/>
-          <w:b/>
-        </w:rPr>
-        <w:t xml:space="preserve">reward-based training</w:t>
-      </w:r>
-      <w:r>
-        <w:t xml:space="preserve"> </w:t>
-      </w:r>
-      <w:r>
-        <w:t xml:space="preserve">as the sensible default: teach what you want, pay for it, skip kit and</w:t>
-      </w:r>
-      <w:r>
-        <w:t xml:space="preserve"> </w:t>
-      </w:r>
-      <w:r>
-        <w:t xml:space="preserve">“</w:t>
-      </w:r>
-      <w:r>
-        <w:t xml:space="preserve">corrections</w:t>
-      </w:r>
-      <w:r>
-        <w:t xml:space="preserve">”</w:t>
-      </w:r>
-      <w:r>
-        <w:t xml:space="preserve"> </w:t>
-      </w:r>
-      <w:r>
-        <w:t xml:space="preserve">that rely on pain or fear. This book follows that line because it works</w:t>
+        <w:t xml:space="preserve">UK guidance says teach what you want and</w:t>
+      </w:r>
+      <w:r>
+        <w:t xml:space="preserve"> </w:t>
+      </w:r>
+      <w:r>
+        <w:rPr>
+          <w:bCs/>
+          <w:b/>
+        </w:rPr>
+        <w:t xml:space="preserve">pay for it with treats, praise, or play</w:t>
+      </w:r>
+      <w:r>
+        <w:t xml:space="preserve"> </w:t>
+      </w:r>
+      <w:r>
+        <w:t xml:space="preserve">— not with fear, pain, or intimidation. This book follows that line because it works</w:t>
       </w:r>
       <w:r>
         <w:t xml:space="preserve"> </w:t>
@@ -1541,13 +1423,13 @@
     </w:p>
     <w:bookmarkEnd w:id="34"/>
     <w:bookmarkEnd w:id="35"/>
-    <w:bookmarkStart w:id="44" w:name="Xe9198539be65d3d32098edba9490c658ced37dd"/>
+    <w:bookmarkStart w:id="44" w:name="X65768870b993ce9800f8394a4a5190d373819b2"/>
     <w:p>
       <w:pPr>
         <w:pStyle w:val="Heading2"/>
       </w:pPr>
       <w:r>
-        <w:t xml:space="preserve">Section 2 — The Training the Human system (our concept)</w:t>
+        <w:t xml:space="preserve">Section 2 — Training the Human — how this book works (plain version)</w:t>
       </w:r>
     </w:p>
     <w:p>
@@ -1555,20 +1437,7 @@
         <w:pStyle w:val="FirstParagraph"/>
       </w:pPr>
       <w:r>
-        <w:t xml:space="preserve">Here is the subtitle joke, and it names the</w:t>
-      </w:r>
-      <w:r>
-        <w:t xml:space="preserve"> </w:t>
-      </w:r>
-      <w:r>
-        <w:rPr>
-          <w:bCs/>
-          <w:b/>
-        </w:rPr>
-        <w:t xml:space="preserve">concept</w:t>
-      </w:r>
-      <w:r>
-        <w:t xml:space="preserve">: in most kitchens,</w:t>
+        <w:t xml:space="preserve">Here is the subtitle joke, and it names the idea: in most kitchens,</w:t>
       </w:r>
       <w:r>
         <w:t xml:space="preserve"> </w:t>
@@ -1597,7 +1466,7 @@
         <w:t xml:space="preserve"> </w:t>
       </w:r>
       <w:r>
-        <w:t xml:space="preserve">is a wink, not a scolding. The system below is how this book keeps</w:t>
+        <w:t xml:space="preserve">is a wink, not a scolding. The list below is how we keep</w:t>
       </w:r>
       <w:r>
         <w:t xml:space="preserve"> </w:t>
@@ -1613,7 +1482,7 @@
         <w:t xml:space="preserve"> </w:t>
       </w:r>
       <w:r>
-        <w:t xml:space="preserve">frustration from becoming</w:t>
+        <w:t xml:space="preserve">bad day from becoming</w:t>
       </w:r>
       <w:r>
         <w:t xml:space="preserve"> </w:t>
@@ -1629,7 +1498,7 @@
         <w:t xml:space="preserve"> </w:t>
       </w:r>
       <w:r>
-        <w:t xml:space="preserve">problem.</w:t>
+        <w:t xml:space="preserve">bad day.</w:t>
       </w:r>
     </w:p>
     <w:p>
@@ -1647,97 +1516,19 @@
           <w:bCs/>
           <w:b/>
         </w:rPr>
-        <w:t xml:space="preserve">how the parts connect</w:t>
+        <w:t xml:space="preserve">how the pieces fit</w:t>
       </w:r>
       <w:r>
         <w:t xml:space="preserve">.</w:t>
       </w:r>
     </w:p>
-    <w:bookmarkStart w:id="36" w:name="the-deal-why-this-book-exists"/>
+    <w:bookmarkStart w:id="36" w:name="the-basics-most-people-want"/>
     <w:p>
       <w:pPr>
         <w:pStyle w:val="Heading3"/>
       </w:pPr>
       <w:r>
-        <w:t xml:space="preserve">The deal (why this book exists)</w:t>
-      </w:r>
-    </w:p>
-    <w:p>
-      <w:pPr>
-        <w:pStyle w:val="FirstParagraph"/>
-      </w:pPr>
-      <w:r>
-        <w:t xml:space="preserve">Training works when you</w:t>
-      </w:r>
-      <w:r>
-        <w:t xml:space="preserve"> </w:t>
-      </w:r>
-      <w:r>
-        <w:rPr>
-          <w:bCs/>
-          <w:b/>
-        </w:rPr>
-        <w:t xml:space="preserve">set the dog up to succeed</w:t>
-      </w:r>
-      <w:r>
-        <w:t xml:space="preserve">,</w:t>
-      </w:r>
-      <w:r>
-        <w:t xml:space="preserve"> </w:t>
-      </w:r>
-      <w:r>
-        <w:rPr>
-          <w:bCs/>
-          <w:b/>
-        </w:rPr>
-        <w:t xml:space="preserve">pay for what you want</w:t>
-      </w:r>
-      <w:r>
-        <w:t xml:space="preserve">,</w:t>
-      </w:r>
-      <w:r>
-        <w:t xml:space="preserve"> </w:t>
-      </w:r>
-      <w:r>
-        <w:rPr>
-          <w:bCs/>
-          <w:b/>
-        </w:rPr>
-        <w:t xml:space="preserve">notice discomfort early</w:t>
-      </w:r>
-      <w:r>
-        <w:t xml:space="preserve">, and</w:t>
-      </w:r>
-      <w:r>
-        <w:t xml:space="preserve"> </w:t>
-      </w:r>
-      <w:r>
-        <w:rPr>
-          <w:bCs/>
-          <w:b/>
-        </w:rPr>
-        <w:t xml:space="preserve">match difficulty to the real world</w:t>
-      </w:r>
-      <w:r>
-        <w:t xml:space="preserve">. Management, vet care, and qualified behaviour help are part of good training, not admissions of failure.</w:t>
-      </w:r>
-    </w:p>
-    <w:bookmarkEnd w:id="36"/>
-    <w:bookmarkStart w:id="37" w:name="four-doors-pick-the-right-tool"/>
-    <w:p>
-      <w:pPr>
-        <w:pStyle w:val="Heading3"/>
-      </w:pPr>
-      <w:r>
-        <w:t xml:space="preserve">Four doors (pick the right tool)</w:t>
-      </w:r>
-    </w:p>
-    <w:p>
-      <w:pPr>
-        <w:pStyle w:val="FirstParagraph"/>
-      </w:pPr>
-      <w:r>
-        <w:t xml:space="preserve">When something goes wrong, ask which door you should walk through:</w:t>
+        <w:t xml:space="preserve">The basics most people want</w:t>
       </w:r>
     </w:p>
     <w:p>
@@ -1753,13 +1544,13 @@
           <w:bCs/>
           <w:b/>
         </w:rPr>
-        <w:t xml:space="preserve">Teach</w:t>
-      </w:r>
-      <w:r>
-        <w:t xml:space="preserve"> </w:t>
-      </w:r>
-      <w:r>
-        <w:t xml:space="preserve">— a skill is missing. Sit, settle, come, tolerate handling.</w:t>
+        <w:t xml:space="preserve">Sit</w:t>
+      </w:r>
+      <w:r>
+        <w:t xml:space="preserve"> </w:t>
+      </w:r>
+      <w:r>
+        <w:t xml:space="preserve">— useful in the kitchen, at the door, when guests arrive.</w:t>
       </w:r>
       <w:r>
         <w:br/>
@@ -1778,13 +1569,13 @@
           <w:bCs/>
           <w:b/>
         </w:rPr>
-        <w:t xml:space="preserve">Manage</w:t>
-      </w:r>
-      <w:r>
-        <w:t xml:space="preserve"> </w:t>
-      </w:r>
-      <w:r>
-        <w:t xml:space="preserve">— stop rehearsal while you teach. Gates, leads, quiet walk times, shoes in a cupboard.</w:t>
+        <w:t xml:space="preserve">Come</w:t>
+      </w:r>
+      <w:r>
+        <w:t xml:space="preserve"> </w:t>
+      </w:r>
+      <w:r>
+        <w:t xml:space="preserve">— back to you when it matters.</w:t>
       </w:r>
       <w:r>
         <w:br/>
@@ -1803,38 +1594,13 @@
           <w:bCs/>
           <w:b/>
         </w:rPr>
-        <w:t xml:space="preserve">Vet</w:t>
-      </w:r>
-      <w:r>
-        <w:t xml:space="preserve"> </w:t>
-      </w:r>
-      <w:r>
-        <w:t xml:space="preserve">— pain or illness when behaviour suddenly shifts.</w:t>
-      </w:r>
-      <w:r>
-        <w:br/>
-      </w:r>
-    </w:p>
-    <w:p>
-      <w:pPr>
-        <w:numPr>
-          <w:ilvl w:val="0"/>
-          <w:numId w:val="1007"/>
-        </w:numPr>
-        <w:pStyle w:val="Compact"/>
-      </w:pPr>
-      <w:r>
-        <w:rPr>
-          <w:bCs/>
-          <w:b/>
-        </w:rPr>
-        <w:t xml:space="preserve">Behaviour help</w:t>
-      </w:r>
-      <w:r>
-        <w:t xml:space="preserve"> </w:t>
-      </w:r>
-      <w:r>
-        <w:t xml:space="preserve">— serious fear, aggression, or patterns that need a professional eye.</w:t>
+        <w:t xml:space="preserve">Walk nicely</w:t>
+      </w:r>
+      <w:r>
+        <w:t xml:space="preserve"> </w:t>
+      </w:r>
+      <w:r>
+        <w:t xml:space="preserve">— without you being dragged into a bush.</w:t>
       </w:r>
     </w:p>
     <w:p>
@@ -1842,43 +1608,33 @@
         <w:pStyle w:val="FirstParagraph"/>
       </w:pPr>
       <w:r>
-        <w:t xml:space="preserve">Using a lead so your dog does not rehearse lunging at bikes is</w:t>
-      </w:r>
-      <w:r>
-        <w:t xml:space="preserve"> </w:t>
-      </w:r>
-      <w:r>
-        <w:rPr>
-          <w:bCs/>
-          <w:b/>
-        </w:rPr>
-        <w:t xml:space="preserve">smart</w:t>
-      </w:r>
-      <w:r>
-        <w:t xml:space="preserve">, not failure. Calling the vet because the formerly sociable dog snaps when touched is</w:t>
-      </w:r>
-      <w:r>
-        <w:t xml:space="preserve"> </w:t>
-      </w:r>
-      <w:r>
-        <w:rPr>
-          <w:bCs/>
-          <w:b/>
-        </w:rPr>
-        <w:t xml:space="preserve">kind</w:t>
-      </w:r>
-      <w:r>
-        <w:t xml:space="preserve">, not dramatic.</w:t>
-      </w:r>
-    </w:p>
-    <w:bookmarkEnd w:id="37"/>
-    <w:bookmarkStart w:id="38" w:name="X7f2ca55d78fe552c0a54f5b19a3618b5bc1fe6e"/>
+        <w:t xml:space="preserve">Everything else in the book supports those three or helps when life is harder (puppies, rescues, worry on walks).</w:t>
+      </w:r>
+      <w:r>
+        <w:t xml:space="preserve"> </w:t>
+      </w:r>
+      <w:r>
+        <w:rPr>
+          <w:bCs/>
+          <w:b/>
+        </w:rPr>
+        <w:t xml:space="preserve">You are allowed to stop at basics</w:t>
+      </w:r>
+      <w:r>
+        <w:t xml:space="preserve"> </w:t>
+      </w:r>
+      <w:r>
+        <w:t xml:space="preserve">and still have a good dog.</w:t>
+      </w:r>
+    </w:p>
+    <w:bookmarkEnd w:id="36"/>
+    <w:bookmarkStart w:id="37" w:name="four-ways-to-help-pick-the-right-one"/>
     <w:p>
       <w:pPr>
         <w:pStyle w:val="Heading3"/>
       </w:pPr>
       <w:r>
-        <w:t xml:space="preserve">The teaching loop (when you are actively teaching)</w:t>
+        <w:t xml:space="preserve">Four ways to help (pick the right one)</w:t>
       </w:r>
     </w:p>
     <w:p>
@@ -1886,60 +1642,7 @@
         <w:pStyle w:val="FirstParagraph"/>
       </w:pPr>
       <w:r>
-        <w:t xml:space="preserve">One habit for every skill. Chapter 4 installs it in your hands. The shape:</w:t>
-      </w:r>
-    </w:p>
-    <w:p>
-      <w:pPr>
-        <w:pStyle w:val="BodyText"/>
-      </w:pPr>
-      <w:r>
-        <w:rPr>
-          <w:bCs/>
-          <w:b/>
-        </w:rPr>
-        <w:t xml:space="preserve">Setup → cue → behaviour → mark/reward → release → reset.</w:t>
-      </w:r>
-    </w:p>
-    <w:p>
-      <w:pPr>
-        <w:pStyle w:val="BodyText"/>
-      </w:pPr>
-      <w:r>
-        <w:t xml:space="preserve">You teach. You pay. You let the dog breathe. You try again. No car-alarm cues.</w:t>
-      </w:r>
-    </w:p>
-    <w:bookmarkEnd w:id="38"/>
-    <w:bookmarkStart w:id="39" w:name="the-five-checks-when-you-are-stuck"/>
-    <w:p>
-      <w:pPr>
-        <w:pStyle w:val="Heading3"/>
-      </w:pPr>
-      <w:r>
-        <w:t xml:space="preserve">The five checks (when you are stuck)</w:t>
-      </w:r>
-    </w:p>
-    <w:p>
-      <w:pPr>
-        <w:pStyle w:val="FirstParagraph"/>
-      </w:pPr>
-      <w:r>
-        <w:t xml:space="preserve">Before you repeat a cue louder or decide the dog is</w:t>
-      </w:r>
-      <w:r>
-        <w:t xml:space="preserve"> </w:t>
-      </w:r>
-      <w:r>
-        <w:t xml:space="preserve">“</w:t>
-      </w:r>
-      <w:r>
-        <w:t xml:space="preserve">difficult</w:t>
-      </w:r>
-      <w:r>
-        <w:t xml:space="preserve">”</w:t>
-      </w:r>
-      <w:r>
-        <w:t xml:space="preserve">, run the checks. Chapter 14 gives the full table. The names are the system:</w:t>
+        <w:t xml:space="preserve">When something goes wrong, ask:</w:t>
       </w:r>
     </w:p>
     <w:p>
@@ -1955,13 +1658,13 @@
           <w:bCs/>
           <w:b/>
         </w:rPr>
-        <w:t xml:space="preserve">Setup</w:t>
-      </w:r>
-      <w:r>
-        <w:t xml:space="preserve"> </w:t>
-      </w:r>
-      <w:r>
-        <w:t xml:space="preserve">— calm enough for this dog today?</w:t>
+        <w:t xml:space="preserve">Teach</w:t>
+      </w:r>
+      <w:r>
+        <w:t xml:space="preserve"> </w:t>
+      </w:r>
+      <w:r>
+        <w:t xml:space="preserve">— they do not know the skill yet. Sit, settle, come, tolerate a gentle touch.</w:t>
       </w:r>
       <w:r>
         <w:br/>
@@ -1980,13 +1683,13 @@
           <w:bCs/>
           <w:b/>
         </w:rPr>
-        <w:t xml:space="preserve">Reward</w:t>
-      </w:r>
-      <w:r>
-        <w:t xml:space="preserve"> </w:t>
-      </w:r>
-      <w:r>
-        <w:t xml:space="preserve">— do they want what you are offering right now?</w:t>
+        <w:t xml:space="preserve">Prevent</w:t>
+      </w:r>
+      <w:r>
+        <w:t xml:space="preserve"> </w:t>
+      </w:r>
+      <w:r>
+        <w:t xml:space="preserve">— stop the chaos while you teach. Baby gate, lead on, shoes out of reach, quieter walk time.</w:t>
       </w:r>
       <w:r>
         <w:br/>
@@ -2005,13 +1708,13 @@
           <w:bCs/>
           <w:b/>
         </w:rPr>
-        <w:t xml:space="preserve">Criterion</w:t>
-      </w:r>
-      <w:r>
-        <w:t xml:space="preserve"> </w:t>
-      </w:r>
-      <w:r>
-        <w:t xml:space="preserve">— one clear ask, not three at once?</w:t>
+        <w:t xml:space="preserve">Vet</w:t>
+      </w:r>
+      <w:r>
+        <w:t xml:space="preserve"> </w:t>
+      </w:r>
+      <w:r>
+        <w:t xml:space="preserve">— sudden change, pain, or illness might be in the way.</w:t>
       </w:r>
       <w:r>
         <w:br/>
@@ -2030,54 +1733,13 @@
           <w:bCs/>
           <w:b/>
         </w:rPr>
-        <w:t xml:space="preserve">Comfort</w:t>
-      </w:r>
-      <w:r>
-        <w:t xml:space="preserve"> </w:t>
-      </w:r>
-      <w:r>
-        <w:t xml:space="preserve">— stress showing? Pause or simplify. Chapter 12 deepens this before live skills.</w:t>
-      </w:r>
-      <w:r>
-        <w:br/>
-      </w:r>
-    </w:p>
-    <w:p>
-      <w:pPr>
-        <w:numPr>
-          <w:ilvl w:val="0"/>
-          <w:numId w:val="1008"/>
-        </w:numPr>
-        <w:pStyle w:val="Compact"/>
-      </w:pPr>
-      <w:r>
-        <w:rPr>
-          <w:bCs/>
-          <w:b/>
-        </w:rPr>
-        <w:t xml:space="preserve">Context</w:t>
-      </w:r>
-      <w:r>
-        <w:t xml:space="preserve"> </w:t>
-      </w:r>
-      <w:r>
-        <w:t xml:space="preserve">— worked at home but failed on the pavement?</w:t>
-      </w:r>
-      <w:r>
-        <w:t xml:space="preserve"> </w:t>
-      </w:r>
-      <w:r>
-        <w:rPr>
-          <w:bCs/>
-          <w:b/>
-        </w:rPr>
-        <w:t xml:space="preserve">Shrink the world</w:t>
-      </w:r>
-      <w:r>
-        <w:t xml:space="preserve"> </w:t>
-      </w:r>
-      <w:r>
-        <w:t xml:space="preserve">until success is likely again.</w:t>
+        <w:t xml:space="preserve">Expert help</w:t>
+      </w:r>
+      <w:r>
+        <w:t xml:space="preserve"> </w:t>
+      </w:r>
+      <w:r>
+        <w:t xml:space="preserve">— serious fear, aggression, or you are out of your depth. That is sensible, not failure.</w:t>
       </w:r>
     </w:p>
     <w:p>
@@ -2085,7 +1747,51 @@
         <w:pStyle w:val="FirstParagraph"/>
       </w:pPr>
       <w:r>
-        <w:t xml:space="preserve">Your stall phrase when any check fails:</w:t>
+        <w:t xml:space="preserve">A lead so your dog does not charge at bikes is</w:t>
+      </w:r>
+      <w:r>
+        <w:t xml:space="preserve"> </w:t>
+      </w:r>
+      <w:r>
+        <w:rPr>
+          <w:bCs/>
+          <w:b/>
+        </w:rPr>
+        <w:t xml:space="preserve">smart</w:t>
+      </w:r>
+      <w:r>
+        <w:t xml:space="preserve">. A vet visit when a friendly dog starts snapping is</w:t>
+      </w:r>
+      <w:r>
+        <w:t xml:space="preserve"> </w:t>
+      </w:r>
+      <w:r>
+        <w:rPr>
+          <w:bCs/>
+          <w:b/>
+        </w:rPr>
+        <w:t xml:space="preserve">kind</w:t>
+      </w:r>
+      <w:r>
+        <w:t xml:space="preserve">.</w:t>
+      </w:r>
+    </w:p>
+    <w:bookmarkEnd w:id="37"/>
+    <w:bookmarkStart w:id="38" w:name="one-teaching-habit-every-skill-uses-it"/>
+    <w:p>
+      <w:pPr>
+        <w:pStyle w:val="Heading3"/>
+      </w:pPr>
+      <w:r>
+        <w:t xml:space="preserve">One teaching habit (every skill uses it)</w:t>
+      </w:r>
+    </w:p>
+    <w:p>
+      <w:pPr>
+        <w:pStyle w:val="FirstParagraph"/>
+      </w:pPr>
+      <w:r>
+        <w:t xml:space="preserve">Chapter 4 walks you through it slowly. For now, the plain version:</w:t>
       </w:r>
     </w:p>
     <w:p>
@@ -2097,79 +1803,43 @@
           <w:bCs/>
           <w:b/>
         </w:rPr>
+        <w:t xml:space="preserve">Get ready → ask once → pay when they do it → let them off the hook → start fresh.</w:t>
+      </w:r>
+    </w:p>
+    <w:p>
+      <w:pPr>
+        <w:pStyle w:val="BodyText"/>
+      </w:pPr>
+      <w:r>
+        <w:t xml:space="preserve">Treats or praise count as pay. Repeating</w:t>
+      </w:r>
+      <w:r>
+        <w:t xml:space="preserve"> </w:t>
+      </w:r>
+      <w:r>
         <w:t xml:space="preserve">“</w:t>
       </w:r>
       <w:r>
-        <w:rPr>
-          <w:bCs/>
-          <w:b/>
-        </w:rPr>
-        <w:t xml:space="preserve">Make it easier — then ask again.</w:t>
-      </w:r>
-      <w:r>
-        <w:rPr>
-          <w:bCs/>
-          <w:b/>
-        </w:rPr>
+        <w:t xml:space="preserve">sit sit SIT</w:t>
+      </w:r>
+      <w:r>
         <w:t xml:space="preserve">”</w:t>
       </w:r>
-    </w:p>
-    <w:p>
-      <w:pPr>
-        <w:pStyle w:val="BodyText"/>
-      </w:pPr>
-      <w:r>
-        <w:t xml:space="preserve">Optional habit when</w:t>
-      </w:r>
-      <w:r>
-        <w:t xml:space="preserve"> </w:t>
-      </w:r>
-      <w:r>
-        <w:rPr>
-          <w:bCs/>
-          <w:b/>
-        </w:rPr>
-        <w:t xml:space="preserve">you</w:t>
-      </w:r>
-      <w:r>
-        <w:t xml:space="preserve"> </w:t>
-      </w:r>
-      <w:r>
-        <w:t xml:space="preserve">fix the plan: a quiet</w:t>
-      </w:r>
-      <w:r>
-        <w:t xml:space="preserve"> </w:t>
-      </w:r>
-      <w:r>
-        <w:rPr>
-          <w:bCs/>
-          <w:b/>
-        </w:rPr>
-        <w:t xml:space="preserve">“</w:t>
-      </w:r>
-      <w:r>
-        <w:rPr>
-          <w:bCs/>
-          <w:b/>
-        </w:rPr>
-        <w:t xml:space="preserve">Good human.</w:t>
-      </w:r>
-      <w:r>
-        <w:rPr>
-          <w:bCs/>
-          <w:b/>
-        </w:rPr>
-        <w:t xml:space="preserve">”</w:t>
-      </w:r>
-    </w:p>
-    <w:bookmarkEnd w:id="39"/>
-    <w:bookmarkStart w:id="40" w:name="dual-track-every-skill-two-jobs"/>
+      <w:r>
+        <w:t xml:space="preserve"> </w:t>
+      </w:r>
+      <w:r>
+        <w:t xml:space="preserve">is not teaching. It is nagging.</w:t>
+      </w:r>
+    </w:p>
+    <w:bookmarkEnd w:id="38"/>
+    <w:bookmarkStart w:id="39" w:name="five-quick-questions-when-you-are-stuck"/>
     <w:p>
       <w:pPr>
         <w:pStyle w:val="Heading3"/>
       </w:pPr>
       <w:r>
-        <w:t xml:space="preserve">Dual track (every skill, two jobs)</w:t>
+        <w:t xml:space="preserve">Five quick questions (when you are stuck)</w:t>
       </w:r>
     </w:p>
     <w:p>
@@ -2177,488 +1847,7 @@
         <w:pStyle w:val="FirstParagraph"/>
       </w:pPr>
       <w:r>
-        <w:t xml:space="preserve">Every major topic in this book splits</w:t>
-      </w:r>
-      <w:r>
-        <w:t xml:space="preserve"> </w:t>
-      </w:r>
-      <w:r>
-        <w:rPr>
-          <w:bCs/>
-          <w:b/>
-        </w:rPr>
-        <w:t xml:space="preserve">your</w:t>
-      </w:r>
-      <w:r>
-        <w:t xml:space="preserve"> </w:t>
-      </w:r>
-      <w:r>
-        <w:t xml:space="preserve">job from</w:t>
-      </w:r>
-      <w:r>
-        <w:t xml:space="preserve"> </w:t>
-      </w:r>
-      <w:r>
-        <w:rPr>
-          <w:bCs/>
-          <w:b/>
-        </w:rPr>
-        <w:t xml:space="preserve">the dog’s</w:t>
-      </w:r>
-      <w:r>
-        <w:t xml:space="preserve"> </w:t>
-      </w:r>
-      <w:r>
-        <w:t xml:space="preserve">job in the same scene:</w:t>
-      </w:r>
-    </w:p>
-    <w:p>
-      <w:pPr>
-        <w:pStyle w:val="BodyText"/>
-      </w:pPr>
-      <w:r>
-        <w:rPr>
-          <w:bCs/>
-          <w:b/>
-        </w:rPr>
-        <w:t xml:space="preserve">Train yourself</w:t>
-      </w:r>
-      <w:r>
-        <w:t xml:space="preserve"> </w:t>
-      </w:r>
-      <w:r>
-        <w:t xml:space="preserve">— plan, patience, stop rules, what your frustration is telling you.</w:t>
-      </w:r>
-      <w:r>
-        <w:br/>
-      </w:r>
-      <w:r>
-        <w:rPr>
-          <w:bCs/>
-          <w:b/>
-        </w:rPr>
-        <w:t xml:space="preserve">Train the dog</w:t>
-      </w:r>
-      <w:r>
-        <w:t xml:space="preserve"> </w:t>
-      </w:r>
-      <w:r>
-        <w:t xml:space="preserve">— what they are learning this session, not obedience theatre.</w:t>
-      </w:r>
-    </w:p>
-    <w:p>
-      <w:pPr>
-        <w:pStyle w:val="BodyText"/>
-      </w:pPr>
-      <w:r>
-        <w:t xml:space="preserve">Each side uses</w:t>
-      </w:r>
-      <w:r>
-        <w:t xml:space="preserve"> </w:t>
-      </w:r>
-      <w:r>
-        <w:rPr>
-          <w:bCs/>
-          <w:b/>
-        </w:rPr>
-        <w:t xml:space="preserve">Know</w:t>
-      </w:r>
-      <w:r>
-        <w:t xml:space="preserve">,</w:t>
-      </w:r>
-      <w:r>
-        <w:t xml:space="preserve"> </w:t>
-      </w:r>
-      <w:r>
-        <w:rPr>
-          <w:bCs/>
-          <w:b/>
-        </w:rPr>
-        <w:t xml:space="preserve">Do</w:t>
-      </w:r>
-      <w:r>
-        <w:t xml:space="preserve">, and</w:t>
-      </w:r>
-      <w:r>
-        <w:t xml:space="preserve"> </w:t>
-      </w:r>
-      <w:r>
-        <w:rPr>
-          <w:bCs/>
-          <w:b/>
-        </w:rPr>
-        <w:t xml:space="preserve">Don’t</w:t>
-      </w:r>
-      <w:r>
-        <w:t xml:space="preserve">. Chapter 4 repeats this shape until it feels normal.</w:t>
-      </w:r>
-    </w:p>
-    <w:bookmarkEnd w:id="40"/>
-    <w:bookmarkStart w:id="41" w:name="place-ladder-where-you-teach"/>
-    <w:p>
-      <w:pPr>
-        <w:pStyle w:val="Heading3"/>
-      </w:pPr>
-      <w:r>
-        <w:t xml:space="preserve">Place ladder (where you teach)</w:t>
-      </w:r>
-    </w:p>
-    <w:p>
-      <w:pPr>
-        <w:pStyle w:val="FirstParagraph"/>
-      </w:pPr>
-      <w:r>
-        <w:rPr>
-          <w:bCs/>
-          <w:b/>
-        </w:rPr>
-        <w:t xml:space="preserve">House → garden → outside.</w:t>
-      </w:r>
-      <w:r>
-        <w:t xml:space="preserve"> </w:t>
-      </w:r>
-      <w:r>
-        <w:t xml:space="preserve">Brains learn in boring rooms before windy pavements. When the street defeats the kitchen, move back a rung.</w:t>
-      </w:r>
-      <w:r>
-        <w:t xml:space="preserve"> </w:t>
-      </w:r>
-      <w:r>
-        <w:rPr>
-          <w:bCs/>
-          <w:b/>
-        </w:rPr>
-        <w:t xml:space="preserve">Make it easier — then ask again.</w:t>
-      </w:r>
-    </w:p>
-    <w:bookmarkEnd w:id="41"/>
-    <w:bookmarkStart w:id="42" w:name="walk-modes-two-kinds-of-outing"/>
-    <w:p>
-      <w:pPr>
-        <w:pStyle w:val="Heading3"/>
-      </w:pPr>
-      <w:r>
-        <w:t xml:space="preserve">Walk modes (two kinds of outing)</w:t>
-      </w:r>
-    </w:p>
-    <w:p>
-      <w:pPr>
-        <w:pStyle w:val="FirstParagraph"/>
-      </w:pPr>
-      <w:r>
-        <w:rPr>
-          <w:bCs/>
-          <w:b/>
-        </w:rPr>
-        <w:t xml:space="preserve">Leisure walk</w:t>
-      </w:r>
-      <w:r>
-        <w:t xml:space="preserve"> </w:t>
-      </w:r>
-      <w:r>
-        <w:t xml:space="preserve">— sniffing, pacing, being a dog. You are not running a lesson. Safe kit still applies.</w:t>
-      </w:r>
-      <w:r>
-        <w:t xml:space="preserve"> </w:t>
-      </w:r>
-      <w:r>
-        <w:rPr>
-          <w:bCs/>
-          <w:b/>
-        </w:rPr>
-        <w:t xml:space="preserve">Stop</w:t>
-      </w:r>
-      <w:r>
-        <w:t xml:space="preserve"> </w:t>
-      </w:r>
-      <w:r>
-        <w:t xml:space="preserve">if things go wrong.</w:t>
-      </w:r>
-    </w:p>
-    <w:p>
-      <w:pPr>
-        <w:pStyle w:val="BodyText"/>
-      </w:pPr>
-      <w:r>
-        <w:rPr>
-          <w:bCs/>
-          <w:b/>
-        </w:rPr>
-        <w:t xml:space="preserve">Training walk</w:t>
-      </w:r>
-      <w:r>
-        <w:t xml:space="preserve"> </w:t>
-      </w:r>
-      <w:r>
-        <w:t xml:space="preserve">— short, on purpose,</w:t>
-      </w:r>
-      <w:r>
-        <w:t xml:space="preserve"> </w:t>
-      </w:r>
-      <w:r>
-        <w:rPr>
-          <w:bCs/>
-          <w:b/>
-        </w:rPr>
-        <w:t xml:space="preserve">one</w:t>
-      </w:r>
-      <w:r>
-        <w:t xml:space="preserve"> </w:t>
-      </w:r>
-      <w:r>
-        <w:t xml:space="preserve">goal. Loose-lead</w:t>
-      </w:r>
-      <w:r>
-        <w:t xml:space="preserve"> </w:t>
-      </w:r>
-      <w:r>
-        <w:rPr>
-          <w:bCs/>
-          <w:b/>
-        </w:rPr>
-        <w:t xml:space="preserve">teaching</w:t>
-      </w:r>
-      <w:r>
-        <w:t xml:space="preserve"> </w:t>
-      </w:r>
-      <w:r>
-        <w:t xml:space="preserve">lives in Chapter 10. Do not mix the modes and then blame the dog for looking fried.</w:t>
-      </w:r>
-    </w:p>
-    <w:bookmarkEnd w:id="42"/>
-    <w:bookmarkStart w:id="43" w:name="what-messes-dogs-up-usually-us"/>
-    <w:p>
-      <w:pPr>
-        <w:pStyle w:val="Heading3"/>
-      </w:pPr>
-      <w:r>
-        <w:t xml:space="preserve">What messes dogs up (usually us)</w:t>
-      </w:r>
-    </w:p>
-    <w:p>
-      <w:pPr>
-        <w:pStyle w:val="FirstParagraph"/>
-      </w:pPr>
-      <w:r>
-        <w:t xml:space="preserve">Most dogs are not broken. They respond to a world that keeps changing the rules.</w:t>
-      </w:r>
-      <w:r>
-        <w:t xml:space="preserve"> </w:t>
-      </w:r>
-      <w:r>
-        <w:rPr>
-          <w:bCs/>
-          <w:b/>
-        </w:rPr>
-        <w:t xml:space="preserve">We often stress them out without noticing.</w:t>
-      </w:r>
-      <w:r>
-        <w:t xml:space="preserve"> </w:t>
-      </w:r>
-      <w:r>
-        <w:t xml:space="preserve">Repeat cues like a car alarm. Train when we are already cross. Skip the gate and shout from the sofa. Ask for pavement proof when the skill only lives in the hallway.</w:t>
-      </w:r>
-    </w:p>
-    <w:p>
-      <w:pPr>
-        <w:pStyle w:val="BodyText"/>
-      </w:pPr>
-      <w:r>
-        <w:t xml:space="preserve">The system is the fix:</w:t>
-      </w:r>
-      <w:r>
-        <w:t xml:space="preserve"> </w:t>
-      </w:r>
-      <w:r>
-        <w:rPr>
-          <w:bCs/>
-          <w:b/>
-        </w:rPr>
-        <w:t xml:space="preserve">four doors</w:t>
-      </w:r>
-      <w:r>
-        <w:t xml:space="preserve">,</w:t>
-      </w:r>
-      <w:r>
-        <w:t xml:space="preserve"> </w:t>
-      </w:r>
-      <w:r>
-        <w:rPr>
-          <w:bCs/>
-          <w:b/>
-        </w:rPr>
-        <w:t xml:space="preserve">loop</w:t>
-      </w:r>
-      <w:r>
-        <w:t xml:space="preserve">,</w:t>
-      </w:r>
-      <w:r>
-        <w:t xml:space="preserve"> </w:t>
-      </w:r>
-      <w:r>
-        <w:rPr>
-          <w:bCs/>
-          <w:b/>
-        </w:rPr>
-        <w:t xml:space="preserve">checks</w:t>
-      </w:r>
-      <w:r>
-        <w:t xml:space="preserve">,</w:t>
-      </w:r>
-      <w:r>
-        <w:t xml:space="preserve"> </w:t>
-      </w:r>
-      <w:r>
-        <w:rPr>
-          <w:bCs/>
-          <w:b/>
-        </w:rPr>
-        <w:t xml:space="preserve">dual track</w:t>
-      </w:r>
-      <w:r>
-        <w:t xml:space="preserve">,</w:t>
-      </w:r>
-      <w:r>
-        <w:t xml:space="preserve"> </w:t>
-      </w:r>
-      <w:r>
-        <w:rPr>
-          <w:bCs/>
-          <w:b/>
-        </w:rPr>
-        <w:t xml:space="preserve">place ladder</w:t>
-      </w:r>
-      <w:r>
-        <w:t xml:space="preserve">,</w:t>
-      </w:r>
-      <w:r>
-        <w:t xml:space="preserve"> </w:t>
-      </w:r>
-      <w:r>
-        <w:rPr>
-          <w:bCs/>
-          <w:b/>
-        </w:rPr>
-        <w:t xml:space="preserve">walk mode</w:t>
-      </w:r>
-      <w:r>
-        <w:t xml:space="preserve">,</w:t>
-      </w:r>
-      <w:r>
-        <w:t xml:space="preserve"> </w:t>
-      </w:r>
-      <w:r>
-        <w:rPr>
-          <w:bCs/>
-          <w:b/>
-        </w:rPr>
-        <w:t xml:space="preserve">mantra</w:t>
-      </w:r>
-      <w:r>
-        <w:t xml:space="preserve">. Same toolkit whether you are in the kitchen or on the high street.</w:t>
-      </w:r>
-    </w:p>
-    <w:p>
-      <w:pPr>
-        <w:pStyle w:val="BodyText"/>
-      </w:pPr>
-      <w:r>
-        <w:t xml:space="preserve">When progress stalls, the heat you feel — embarrassment, impatience, that tight</w:t>
-      </w:r>
-      <w:r>
-        <w:t xml:space="preserve"> </w:t>
-      </w:r>
-      <w:r>
-        <w:t xml:space="preserve">“</w:t>
-      </w:r>
-      <w:r>
-        <w:t xml:space="preserve">why won’t you just</w:t>
-      </w:r>
-      <w:r>
-        <w:t xml:space="preserve">”</w:t>
-      </w:r>
-      <w:r>
-        <w:t xml:space="preserve"> </w:t>
-      </w:r>
-      <w:r>
-        <w:t xml:space="preserve">feeling — is</w:t>
-      </w:r>
-      <w:r>
-        <w:t xml:space="preserve"> </w:t>
-      </w:r>
-      <w:r>
-        <w:rPr>
-          <w:bCs/>
-          <w:b/>
-        </w:rPr>
-        <w:t xml:space="preserve">information about your plan</w:t>
-      </w:r>
-      <w:r>
-        <w:t xml:space="preserve">, not a verdict on the dog. Dogs feel tight voices, looming hands, and hurry too.</w:t>
-      </w:r>
-      <w:r>
-        <w:t xml:space="preserve"> </w:t>
-      </w:r>
-      <w:r>
-        <w:rPr>
-          <w:bCs/>
-          <w:b/>
-        </w:rPr>
-        <w:t xml:space="preserve">Train the human first.</w:t>
-      </w:r>
-      <w:r>
-        <w:t xml:space="preserve"> </w:t>
-      </w:r>
-      <w:r>
-        <w:t xml:space="preserve">Smaller step. Better pay. Shorter session.</w:t>
-      </w:r>
-      <w:r>
-        <w:t xml:space="preserve"> </w:t>
-      </w:r>
-      <w:r>
-        <w:rPr>
-          <w:bCs/>
-          <w:b/>
-        </w:rPr>
-        <w:t xml:space="preserve">Stop while it is still fun.</w:t>
-      </w:r>
-    </w:p>
-    <w:bookmarkEnd w:id="43"/>
-    <w:bookmarkEnd w:id="44"/>
-    <w:bookmarkStart w:id="47" w:name="Xf21e4cb6a184b7a40714949d18c35cfe97e0531"/>
-    <w:p>
-      <w:pPr>
-        <w:pStyle w:val="Heading2"/>
-      </w:pPr>
-      <w:r>
-        <w:t xml:space="preserve">Section 3 — The system on a walk (dual-track preview)</w:t>
-      </w:r>
-    </w:p>
-    <w:p>
-      <w:pPr>
-        <w:pStyle w:val="FirstParagraph"/>
-      </w:pPr>
-      <w:r>
-        <w:rPr>
-          <w:bCs/>
-          <w:b/>
-        </w:rPr>
-        <w:t xml:space="preserve">Topic:</w:t>
-      </w:r>
-      <w:r>
-        <w:t xml:space="preserve"> </w:t>
-      </w:r>
-      <w:r>
-        <w:t xml:space="preserve">Leisure walk vs training walk — not the same job.</w:t>
-      </w:r>
-    </w:p>
-    <w:bookmarkStart w:id="45" w:name="train-yourself-1"/>
-    <w:p>
-      <w:pPr>
-        <w:pStyle w:val="Heading3"/>
-      </w:pPr>
-      <w:r>
-        <w:t xml:space="preserve">Train yourself</w:t>
+        <w:t xml:space="preserve">Before you shout or decide the dog is hopeless, ask:</w:t>
       </w:r>
     </w:p>
     <w:p>
@@ -2674,31 +1863,13 @@
           <w:bCs/>
           <w:b/>
         </w:rPr>
-        <w:t xml:space="preserve">Know:</w:t>
-      </w:r>
-      <w:r>
-        <w:t xml:space="preserve"> </w:t>
-      </w:r>
-      <w:r>
-        <w:t xml:space="preserve">Sniffing on a leisure walk is not</w:t>
-      </w:r>
-      <w:r>
-        <w:t xml:space="preserve"> </w:t>
-      </w:r>
-      <w:r>
-        <w:t xml:space="preserve">“</w:t>
-      </w:r>
-      <w:r>
-        <w:t xml:space="preserve">ignoring you.</w:t>
-      </w:r>
-      <w:r>
-        <w:t xml:space="preserve">”</w:t>
-      </w:r>
-      <w:r>
-        <w:t xml:space="preserve"> </w:t>
-      </w:r>
-      <w:r>
-        <w:t xml:space="preserve">It is dog email. Your impatience often spikes when you treat every walk like a treadmill.</w:t>
+        <w:t xml:space="preserve">Place</w:t>
+      </w:r>
+      <w:r>
+        <w:t xml:space="preserve"> </w:t>
+      </w:r>
+      <w:r>
+        <w:t xml:space="preserve">— is it too loud or too exciting here?</w:t>
       </w:r>
       <w:r>
         <w:br/>
@@ -2717,13 +1888,13 @@
           <w:bCs/>
           <w:b/>
         </w:rPr>
-        <w:t xml:space="preserve">Do:</w:t>
-      </w:r>
-      <w:r>
-        <w:t xml:space="preserve"> </w:t>
-      </w:r>
-      <w:r>
-        <w:t xml:space="preserve">Say out loud which walk this is before you leave. Leisure or training. Stick to that choice for that outing.</w:t>
+        <w:t xml:space="preserve">Pay</w:t>
+      </w:r>
+      <w:r>
+        <w:t xml:space="preserve"> </w:t>
+      </w:r>
+      <w:r>
+        <w:t xml:space="preserve">— do they want the treat or toy right now?</w:t>
       </w:r>
       <w:r>
         <w:br/>
@@ -2742,23 +1913,513 @@
           <w:bCs/>
           <w:b/>
         </w:rPr>
-        <w:t xml:space="preserve">Don’t:</w:t>
-      </w:r>
-      <w:r>
-        <w:t xml:space="preserve"> </w:t>
-      </w:r>
-      <w:r>
-        <w:t xml:space="preserve">Heel-police a leisure walk and then wonder why the dog looks fried. Don’t expect a relaxed sniff-fest on a day you are actually teaching lead skills.</w:t>
-      </w:r>
-    </w:p>
-    <w:bookmarkEnd w:id="45"/>
-    <w:bookmarkStart w:id="46" w:name="train-the-dog-1"/>
+        <w:t xml:space="preserve">Ask</w:t>
+      </w:r>
+      <w:r>
+        <w:t xml:space="preserve"> </w:t>
+      </w:r>
+      <w:r>
+        <w:t xml:space="preserve">— am I asking for one thing, not five at once?</w:t>
+      </w:r>
+      <w:r>
+        <w:br/>
+      </w:r>
+    </w:p>
+    <w:p>
+      <w:pPr>
+        <w:numPr>
+          <w:ilvl w:val="0"/>
+          <w:numId w:val="1009"/>
+        </w:numPr>
+        <w:pStyle w:val="Compact"/>
+      </w:pPr>
+      <w:r>
+        <w:rPr>
+          <w:bCs/>
+          <w:b/>
+        </w:rPr>
+        <w:t xml:space="preserve">Mood</w:t>
+      </w:r>
+      <w:r>
+        <w:t xml:space="preserve"> </w:t>
+      </w:r>
+      <w:r>
+        <w:t xml:space="preserve">— are they worried or tired? Should we pause? (Chapter 12 helps you read this before big outdoor skills.)</w:t>
+      </w:r>
+      <w:r>
+        <w:br/>
+      </w:r>
+    </w:p>
+    <w:p>
+      <w:pPr>
+        <w:numPr>
+          <w:ilvl w:val="0"/>
+          <w:numId w:val="1009"/>
+        </w:numPr>
+        <w:pStyle w:val="Compact"/>
+      </w:pPr>
+      <w:r>
+        <w:rPr>
+          <w:bCs/>
+          <w:b/>
+        </w:rPr>
+        <w:t xml:space="preserve">Same at home?</w:t>
+      </w:r>
+      <w:r>
+        <w:t xml:space="preserve"> </w:t>
+      </w:r>
+      <w:r>
+        <w:t xml:space="preserve">— if it worked indoors but not on the street, go back to an easier spot.</w:t>
+      </w:r>
+    </w:p>
+    <w:p>
+      <w:pPr>
+        <w:pStyle w:val="FirstParagraph"/>
+      </w:pPr>
+      <w:r>
+        <w:t xml:space="preserve">Chapter 14 has a fuller checklist. Your phrase when any answer is</w:t>
+      </w:r>
+      <w:r>
+        <w:t xml:space="preserve"> </w:t>
+      </w:r>
+      <w:r>
+        <w:t xml:space="preserve">“</w:t>
+      </w:r>
+      <w:r>
+        <w:t xml:space="preserve">no</w:t>
+      </w:r>
+      <w:r>
+        <w:t xml:space="preserve">”</w:t>
+      </w:r>
+      <w:r>
+        <w:t xml:space="preserve">:</w:t>
+      </w:r>
+    </w:p>
+    <w:p>
+      <w:pPr>
+        <w:pStyle w:val="BodyText"/>
+      </w:pPr>
+      <w:r>
+        <w:rPr>
+          <w:bCs/>
+          <w:b/>
+        </w:rPr>
+        <w:t xml:space="preserve">“</w:t>
+      </w:r>
+      <w:r>
+        <w:rPr>
+          <w:bCs/>
+          <w:b/>
+        </w:rPr>
+        <w:t xml:space="preserve">Make it easier — then ask again.</w:t>
+      </w:r>
+      <w:r>
+        <w:rPr>
+          <w:bCs/>
+          <w:b/>
+        </w:rPr>
+        <w:t xml:space="preserve">”</w:t>
+      </w:r>
+    </w:p>
+    <w:p>
+      <w:pPr>
+        <w:pStyle w:val="BodyText"/>
+      </w:pPr>
+      <w:r>
+        <w:t xml:space="preserve">When</w:t>
+      </w:r>
+      <w:r>
+        <w:t xml:space="preserve"> </w:t>
+      </w:r>
+      <w:r>
+        <w:rPr>
+          <w:bCs/>
+          <w:b/>
+        </w:rPr>
+        <w:t xml:space="preserve">you</w:t>
+      </w:r>
+      <w:r>
+        <w:t xml:space="preserve"> </w:t>
+      </w:r>
+      <w:r>
+        <w:t xml:space="preserve">fix the plan, try a quiet</w:t>
+      </w:r>
+      <w:r>
+        <w:t xml:space="preserve"> </w:t>
+      </w:r>
+      <w:r>
+        <w:rPr>
+          <w:bCs/>
+          <w:b/>
+        </w:rPr>
+        <w:t xml:space="preserve">“</w:t>
+      </w:r>
+      <w:r>
+        <w:rPr>
+          <w:bCs/>
+          <w:b/>
+        </w:rPr>
+        <w:t xml:space="preserve">Good human.</w:t>
+      </w:r>
+      <w:r>
+        <w:rPr>
+          <w:bCs/>
+          <w:b/>
+        </w:rPr>
+        <w:t xml:space="preserve">”</w:t>
+      </w:r>
+    </w:p>
+    <w:bookmarkEnd w:id="39"/>
+    <w:bookmarkStart w:id="40" w:name="two-lists-you-and-your-dog"/>
     <w:p>
       <w:pPr>
         <w:pStyle w:val="Heading3"/>
       </w:pPr>
       <w:r>
+        <w:t xml:space="preserve">Two lists (you and your dog)</w:t>
+      </w:r>
+    </w:p>
+    <w:p>
+      <w:pPr>
+        <w:pStyle w:val="FirstParagraph"/>
+      </w:pPr>
+      <w:r>
+        <w:t xml:space="preserve">Most chapters give</w:t>
+      </w:r>
+      <w:r>
+        <w:t xml:space="preserve"> </w:t>
+      </w:r>
+      <w:r>
+        <w:rPr>
+          <w:bCs/>
+          <w:b/>
+        </w:rPr>
+        <w:t xml:space="preserve">two short lists</w:t>
+      </w:r>
+      <w:r>
+        <w:t xml:space="preserve">:</w:t>
+      </w:r>
+    </w:p>
+    <w:p>
+      <w:pPr>
+        <w:pStyle w:val="BodyText"/>
+      </w:pPr>
+      <w:r>
+        <w:rPr>
+          <w:bCs/>
+          <w:b/>
+        </w:rPr>
+        <w:t xml:space="preserve">Train yourself</w:t>
+      </w:r>
+      <w:r>
+        <w:t xml:space="preserve"> </w:t>
+      </w:r>
+      <w:r>
+        <w:t xml:space="preserve">— your plan, your patience, when to stop.</w:t>
+      </w:r>
+      <w:r>
+        <w:br/>
+      </w:r>
+      <w:r>
+        <w:rPr>
+          <w:bCs/>
+          <w:b/>
+        </w:rPr>
         <w:t xml:space="preserve">Train the dog</w:t>
+      </w:r>
+      <w:r>
+        <w:t xml:space="preserve"> </w:t>
+      </w:r>
+      <w:r>
+        <w:t xml:space="preserve">— what they are learning in that lesson.</w:t>
+      </w:r>
+    </w:p>
+    <w:p>
+      <w:pPr>
+        <w:pStyle w:val="BodyText"/>
+      </w:pPr>
+      <w:r>
+        <w:t xml:space="preserve">Each list has</w:t>
+      </w:r>
+      <w:r>
+        <w:t xml:space="preserve"> </w:t>
+      </w:r>
+      <w:r>
+        <w:rPr>
+          <w:bCs/>
+          <w:b/>
+        </w:rPr>
+        <w:t xml:space="preserve">Know</w:t>
+      </w:r>
+      <w:r>
+        <w:t xml:space="preserve">,</w:t>
+      </w:r>
+      <w:r>
+        <w:t xml:space="preserve"> </w:t>
+      </w:r>
+      <w:r>
+        <w:rPr>
+          <w:bCs/>
+          <w:b/>
+        </w:rPr>
+        <w:t xml:space="preserve">Do</w:t>
+      </w:r>
+      <w:r>
+        <w:t xml:space="preserve">, and</w:t>
+      </w:r>
+      <w:r>
+        <w:t xml:space="preserve"> </w:t>
+      </w:r>
+      <w:r>
+        <w:rPr>
+          <w:bCs/>
+          <w:b/>
+        </w:rPr>
+        <w:t xml:space="preserve">Don’t</w:t>
+      </w:r>
+      <w:r>
+        <w:t xml:space="preserve">. Same shape every time so you are not learning a new layout per chapter.</w:t>
+      </w:r>
+    </w:p>
+    <w:bookmarkEnd w:id="40"/>
+    <w:bookmarkStart w:id="41" w:name="where-to-teach"/>
+    <w:p>
+      <w:pPr>
+        <w:pStyle w:val="Heading3"/>
+      </w:pPr>
+      <w:r>
+        <w:t xml:space="preserve">Where to teach</w:t>
+      </w:r>
+    </w:p>
+    <w:p>
+      <w:pPr>
+        <w:pStyle w:val="FirstParagraph"/>
+      </w:pPr>
+      <w:r>
+        <w:rPr>
+          <w:bCs/>
+          <w:b/>
+        </w:rPr>
+        <w:t xml:space="preserve">House → garden → outside.</w:t>
+      </w:r>
+      <w:r>
+        <w:t xml:space="preserve"> </w:t>
+      </w:r>
+      <w:r>
+        <w:t xml:space="preserve">Kitchen before pavement. Boring before exciting. When the street beats the kitchen, go back a step.</w:t>
+      </w:r>
+      <w:r>
+        <w:t xml:space="preserve"> </w:t>
+      </w:r>
+      <w:r>
+        <w:rPr>
+          <w:bCs/>
+          <w:b/>
+        </w:rPr>
+        <w:t xml:space="preserve">Make it easier — then ask again.</w:t>
+      </w:r>
+    </w:p>
+    <w:bookmarkEnd w:id="41"/>
+    <w:bookmarkStart w:id="42" w:name="two-kinds-of-walk"/>
+    <w:p>
+      <w:pPr>
+        <w:pStyle w:val="Heading3"/>
+      </w:pPr>
+      <w:r>
+        <w:t xml:space="preserve">Two kinds of walk</w:t>
+      </w:r>
+    </w:p>
+    <w:p>
+      <w:pPr>
+        <w:pStyle w:val="FirstParagraph"/>
+      </w:pPr>
+      <w:r>
+        <w:rPr>
+          <w:bCs/>
+          <w:b/>
+        </w:rPr>
+        <w:t xml:space="preserve">Leisure walk</w:t>
+      </w:r>
+      <w:r>
+        <w:t xml:space="preserve"> </w:t>
+      </w:r>
+      <w:r>
+        <w:t xml:space="preserve">— sniffing, being a dog. You are not teaching lead manners on this outing.</w:t>
+      </w:r>
+      <w:r>
+        <w:br/>
+      </w:r>
+      <w:r>
+        <w:rPr>
+          <w:bCs/>
+          <w:b/>
+        </w:rPr>
+        <w:t xml:space="preserve">Training walk</w:t>
+      </w:r>
+      <w:r>
+        <w:t xml:space="preserve"> </w:t>
+      </w:r>
+      <w:r>
+        <w:t xml:space="preserve">— short, on purpose,</w:t>
+      </w:r>
+      <w:r>
+        <w:t xml:space="preserve"> </w:t>
+      </w:r>
+      <w:r>
+        <w:rPr>
+          <w:bCs/>
+          <w:b/>
+        </w:rPr>
+        <w:t xml:space="preserve">one</w:t>
+      </w:r>
+      <w:r>
+        <w:t xml:space="preserve"> </w:t>
+      </w:r>
+      <w:r>
+        <w:t xml:space="preserve">goal.</w:t>
+      </w:r>
+      <w:r>
+        <w:t xml:space="preserve"> </w:t>
+      </w:r>
+      <w:r>
+        <w:t xml:space="preserve">“</w:t>
+      </w:r>
+      <w:r>
+        <w:t xml:space="preserve">Walk nicely</w:t>
+      </w:r>
+      <w:r>
+        <w:t xml:space="preserve">”</w:t>
+      </w:r>
+      <w:r>
+        <w:t xml:space="preserve"> </w:t>
+      </w:r>
+      <w:r>
+        <w:t xml:space="preserve">practice lives in</w:t>
+      </w:r>
+      <w:r>
+        <w:t xml:space="preserve"> </w:t>
+      </w:r>
+      <w:r>
+        <w:rPr>
+          <w:bCs/>
+          <w:b/>
+        </w:rPr>
+        <w:t xml:space="preserve">Chapter 10</w:t>
+      </w:r>
+      <w:r>
+        <w:t xml:space="preserve">. Do not mix them and then blame the dog for looking exhausted.</w:t>
+      </w:r>
+    </w:p>
+    <w:bookmarkEnd w:id="42"/>
+    <w:bookmarkStart w:id="43" w:name="what-messes-dogs-up-usually-us"/>
+    <w:p>
+      <w:pPr>
+        <w:pStyle w:val="Heading3"/>
+      </w:pPr>
+      <w:r>
+        <w:t xml:space="preserve">What messes dogs up (usually us)</w:t>
+      </w:r>
+    </w:p>
+    <w:p>
+      <w:pPr>
+        <w:pStyle w:val="FirstParagraph"/>
+      </w:pPr>
+      <w:r>
+        <w:t xml:space="preserve">Most dogs are not broken.</w:t>
+      </w:r>
+      <w:r>
+        <w:t xml:space="preserve"> </w:t>
+      </w:r>
+      <w:r>
+        <w:rPr>
+          <w:bCs/>
+          <w:b/>
+        </w:rPr>
+        <w:t xml:space="preserve">We often stress them out without noticing.</w:t>
+      </w:r>
+      <w:r>
+        <w:t xml:space="preserve"> </w:t>
+      </w:r>
+      <w:r>
+        <w:t xml:space="preserve">Nagging cues. Training when we are already cross. No gate at the door. Asking for street-level</w:t>
+      </w:r>
+      <w:r>
+        <w:t xml:space="preserve"> </w:t>
+      </w:r>
+      <w:r>
+        <w:t xml:space="preserve">“</w:t>
+      </w:r>
+      <w:r>
+        <w:t xml:space="preserve">come</w:t>
+      </w:r>
+      <w:r>
+        <w:t xml:space="preserve">”</w:t>
+      </w:r>
+      <w:r>
+        <w:t xml:space="preserve"> </w:t>
+      </w:r>
+      <w:r>
+        <w:t xml:space="preserve">when they only know living-room</w:t>
+      </w:r>
+      <w:r>
+        <w:t xml:space="preserve"> </w:t>
+      </w:r>
+      <w:r>
+        <w:t xml:space="preserve">“</w:t>
+      </w:r>
+      <w:r>
+        <w:t xml:space="preserve">come.</w:t>
+      </w:r>
+      <w:r>
+        <w:t xml:space="preserve">”</w:t>
+      </w:r>
+    </w:p>
+    <w:p>
+      <w:pPr>
+        <w:pStyle w:val="BodyText"/>
+      </w:pPr>
+      <w:r>
+        <w:rPr>
+          <w:bCs/>
+          <w:b/>
+        </w:rPr>
+        <w:t xml:space="preserve">Train the human first.</w:t>
+      </w:r>
+      <w:r>
+        <w:t xml:space="preserve"> </w:t>
+      </w:r>
+      <w:r>
+        <w:t xml:space="preserve">Smaller step. Better treat. Shorter go.</w:t>
+      </w:r>
+      <w:r>
+        <w:t xml:space="preserve"> </w:t>
+      </w:r>
+      <w:r>
+        <w:rPr>
+          <w:bCs/>
+          <w:b/>
+        </w:rPr>
+        <w:t xml:space="preserve">Stop while it is still fun.</w:t>
+      </w:r>
+    </w:p>
+    <w:bookmarkEnd w:id="43"/>
+    <w:bookmarkEnd w:id="44"/>
+    <w:bookmarkStart w:id="47" w:name="section-3-two-kinds-of-walk-preview"/>
+    <w:p>
+      <w:pPr>
+        <w:pStyle w:val="Heading2"/>
+      </w:pPr>
+      <w:r>
+        <w:t xml:space="preserve">Section 3 — Two kinds of walk (preview)</w:t>
+      </w:r>
+    </w:p>
+    <w:bookmarkStart w:id="45" w:name="train-yourself-1"/>
+    <w:p>
+      <w:pPr>
+        <w:pStyle w:val="Heading3"/>
+      </w:pPr>
+      <w:r>
+        <w:t xml:space="preserve">Train yourself</w:t>
       </w:r>
     </w:p>
     <w:p>
@@ -2780,7 +2441,7 @@
         <w:t xml:space="preserve"> </w:t>
       </w:r>
       <w:r>
-        <w:t xml:space="preserve">Walks can mean different payoffs. Sometimes freedom to sniff. Sometimes</w:t>
+        <w:t xml:space="preserve">Sniffing on a leisure walk is not</w:t>
       </w:r>
       <w:r>
         <w:t xml:space="preserve"> </w:t>
@@ -2789,7 +2450,7 @@
         <w:t xml:space="preserve">“</w:t>
       </w:r>
       <w:r>
-        <w:t xml:space="preserve">check in for a treat.</w:t>
+        <w:t xml:space="preserve">ignoring you.</w:t>
       </w:r>
       <w:r>
         <w:t xml:space="preserve">”</w:t>
@@ -2798,7 +2459,7 @@
         <w:t xml:space="preserve"> </w:t>
       </w:r>
       <w:r>
-        <w:t xml:space="preserve">Mixed signals are confusing.</w:t>
+        <w:t xml:space="preserve">It is dog email. You get cross when every walk feels like a gym session.</w:t>
       </w:r>
       <w:r>
         <w:br/>
@@ -2823,7 +2484,7 @@
         <w:t xml:space="preserve"> </w:t>
       </w:r>
       <w:r>
-        <w:t xml:space="preserve">Learn both modes exist. Training walks stay short and clear. Leisure walks stay dog-shaped.</w:t>
+        <w:t xml:space="preserve">Before you leave, say which walk this is. Leisure or training. Stick to it for that outing.</w:t>
       </w:r>
       <w:r>
         <w:br/>
@@ -2848,76 +2509,29 @@
         <w:t xml:space="preserve"> </w:t>
       </w:r>
       <w:r>
-        <w:t xml:space="preserve">Learn that every outing is a test. Don’t learn that pulling is the only way to reach a smell because leisure and training got blurred into one grim lap.</w:t>
-      </w:r>
-    </w:p>
-    <w:p>
-      <w:pPr>
-        <w:pStyle w:val="FirstParagraph"/>
-      </w:pPr>
-      <w:r>
-        <w:t xml:space="preserve">Chapter 10 separates</w:t>
-      </w:r>
-      <w:r>
-        <w:t xml:space="preserve"> </w:t>
-      </w:r>
-      <w:r>
-        <w:rPr>
-          <w:bCs/>
-          <w:b/>
-        </w:rPr>
-        <w:t xml:space="preserve">loose-lead practice</w:t>
-      </w:r>
-      <w:r>
-        <w:t xml:space="preserve"> </w:t>
-      </w:r>
-      <w:r>
-        <w:t xml:space="preserve">from</w:t>
-      </w:r>
-      <w:r>
-        <w:t xml:space="preserve"> </w:t>
-      </w:r>
-      <w:r>
-        <w:rPr>
-          <w:bCs/>
-          <w:b/>
-        </w:rPr>
-        <w:t xml:space="preserve">everyday sniff walks</w:t>
-      </w:r>
-      <w:r>
-        <w:t xml:space="preserve">. This preview is the system in miniature: your plan on one side, their learning on the other.</w:t>
-      </w:r>
-    </w:p>
-    <w:bookmarkEnd w:id="46"/>
-    <w:bookmarkEnd w:id="47"/>
-    <w:bookmarkStart w:id="48" w:name="X68a090c288c9b4f9f26b1ff8d3f98b61fe57bc0"/>
-    <w:p>
-      <w:pPr>
-        <w:pStyle w:val="Heading2"/>
-      </w:pPr>
-      <w:r>
-        <w:t xml:space="preserve">Section 4 — How the book installs the system</w:t>
-      </w:r>
-    </w:p>
-    <w:p>
-      <w:pPr>
-        <w:pStyle w:val="FirstParagraph"/>
-      </w:pPr>
-      <w:r>
-        <w:t xml:space="preserve">Read in the order in the chapter map, not only by the number on the spine. The system</w:t>
-      </w:r>
-      <w:r>
-        <w:t xml:space="preserve"> </w:t>
-      </w:r>
-      <w:r>
-        <w:rPr>
-          <w:bCs/>
-          <w:b/>
-        </w:rPr>
-        <w:t xml:space="preserve">builds in layers</w:t>
-      </w:r>
-      <w:r>
-        <w:t xml:space="preserve">:</w:t>
+        <w:t xml:space="preserve">Turn a sniff walk into a heel drill. Don’t expect a chill sniff day on a day you meant to teach</w:t>
+      </w:r>
+      <w:r>
+        <w:t xml:space="preserve"> </w:t>
+      </w:r>
+      <w:r>
+        <w:t xml:space="preserve">“</w:t>
+      </w:r>
+      <w:r>
+        <w:t xml:space="preserve">walk nicely.</w:t>
+      </w:r>
+      <w:r>
+        <w:t xml:space="preserve">”</w:t>
+      </w:r>
+    </w:p>
+    <w:bookmarkEnd w:id="45"/>
+    <w:bookmarkStart w:id="46" w:name="train-the-dog-1"/>
+    <w:p>
+      <w:pPr>
+        <w:pStyle w:val="Heading3"/>
+      </w:pPr>
+      <w:r>
+        <w:t xml:space="preserve">Train the dog</w:t>
       </w:r>
     </w:p>
     <w:p>
@@ -2933,13 +2547,25 @@
           <w:bCs/>
           <w:b/>
         </w:rPr>
-        <w:t xml:space="preserve">Part I (Chapters 1–3)</w:t>
-      </w:r>
-      <w:r>
-        <w:t xml:space="preserve"> </w:t>
-      </w:r>
-      <w:r>
-        <w:t xml:space="preserve">— mindset, how dogs learn, your toolkit.</w:t>
+        <w:t xml:space="preserve">Know:</w:t>
+      </w:r>
+      <w:r>
+        <w:t xml:space="preserve"> </w:t>
+      </w:r>
+      <w:r>
+        <w:t xml:space="preserve">Walks can mean different things. Sometimes freedom to sniff. Sometimes</w:t>
+      </w:r>
+      <w:r>
+        <w:t xml:space="preserve"> </w:t>
+      </w:r>
+      <w:r>
+        <w:t xml:space="preserve">“</w:t>
+      </w:r>
+      <w:r>
+        <w:t xml:space="preserve">check in for a treat.</w:t>
+      </w:r>
+      <w:r>
+        <w:t xml:space="preserve">”</w:t>
       </w:r>
       <w:r>
         <w:br/>
@@ -2958,13 +2584,13 @@
           <w:bCs/>
           <w:b/>
         </w:rPr>
-        <w:t xml:space="preserve">Part II (Chapters 4–6)</w:t>
-      </w:r>
-      <w:r>
-        <w:t xml:space="preserve"> </w:t>
-      </w:r>
-      <w:r>
-        <w:t xml:space="preserve">— teaching loop, criteria, progression without pressure.</w:t>
+        <w:t xml:space="preserve">Do:</w:t>
+      </w:r>
+      <w:r>
+        <w:t xml:space="preserve"> </w:t>
+      </w:r>
+      <w:r>
+        <w:t xml:space="preserve">Learn both types exist. Training walks stay short. Leisure walks stay dog-shaped.</w:t>
       </w:r>
       <w:r>
         <w:br/>
@@ -2983,91 +2609,452 @@
           <w:bCs/>
           <w:b/>
         </w:rPr>
+        <w:t xml:space="preserve">Don’t:</w:t>
+      </w:r>
+      <w:r>
+        <w:t xml:space="preserve"> </w:t>
+      </w:r>
+      <w:r>
+        <w:t xml:space="preserve">Learn that every outing is a test. Don’t learn that pulling is the only way to the good smell because you mixed the two types.</w:t>
+      </w:r>
+    </w:p>
+    <w:p>
+      <w:pPr>
+        <w:pStyle w:val="FirstParagraph"/>
+      </w:pPr>
+      <w:r>
+        <w:t xml:space="preserve">Chapter 10 is where</w:t>
+      </w:r>
+      <w:r>
+        <w:t xml:space="preserve"> </w:t>
+      </w:r>
+      <w:r>
+        <w:rPr>
+          <w:bCs/>
+          <w:b/>
+        </w:rPr>
+        <w:t xml:space="preserve">walk nicely</w:t>
+      </w:r>
+      <w:r>
+        <w:t xml:space="preserve"> </w:t>
+      </w:r>
+      <w:r>
+        <w:t xml:space="preserve">gets taught step by step. This preview is the idea: your plan on one side, their learning on the other.</w:t>
+      </w:r>
+    </w:p>
+    <w:bookmarkEnd w:id="46"/>
+    <w:bookmarkEnd w:id="47"/>
+    <w:bookmarkStart w:id="48" w:name="X59e0bcf9010cf9e0303b1b622ce28bc17dcbd23"/>
+    <w:p>
+      <w:pPr>
+        <w:pStyle w:val="Heading2"/>
+      </w:pPr>
+      <w:r>
+        <w:t xml:space="preserve">Section 4 — How to use this book (including bookmarks)</w:t>
+      </w:r>
+    </w:p>
+    <w:p>
+      <w:pPr>
+        <w:pStyle w:val="FirstParagraph"/>
+      </w:pPr>
+      <w:r>
+        <w:t xml:space="preserve">You do</w:t>
+      </w:r>
+      <w:r>
+        <w:t xml:space="preserve"> </w:t>
+      </w:r>
+      <w:r>
+        <w:rPr>
+          <w:bCs/>
+          <w:b/>
+        </w:rPr>
+        <w:t xml:space="preserve">not</w:t>
+      </w:r>
+      <w:r>
+        <w:t xml:space="preserve"> </w:t>
+      </w:r>
+      <w:r>
+        <w:t xml:space="preserve">have to read cover to cover in one go. Most owners should not.</w:t>
+      </w:r>
+    </w:p>
+    <w:p>
+      <w:pPr>
+        <w:pStyle w:val="BodyText"/>
+      </w:pPr>
+      <w:r>
+        <w:rPr>
+          <w:bCs/>
+          <w:b/>
+        </w:rPr>
+        <w:t xml:space="preserve">Use it like a cookbook.</w:t>
+      </w:r>
+      <w:r>
+        <w:t xml:space="preserve"> </w:t>
+      </w:r>
+      <w:r>
+        <w:t xml:space="preserve">Find the bit you need.</w:t>
+      </w:r>
+      <w:r>
+        <w:t xml:space="preserve"> </w:t>
+      </w:r>
+      <w:r>
+        <w:rPr>
+          <w:bCs/>
+          <w:b/>
+        </w:rPr>
+        <w:t xml:space="preserve">Bookmark it</w:t>
+      </w:r>
+      <w:r>
+        <w:t xml:space="preserve"> </w:t>
+      </w:r>
+      <w:r>
+        <w:t xml:space="preserve">— sticky note, folded corner, app bookmark, photo of the page. Come back when life changes.</w:t>
+      </w:r>
+    </w:p>
+    <w:tbl>
+      <w:tblPr>
+        <w:tblStyle w:val="Table"/>
+        <w:tblW w:type="pct" w:w="5000"/>
+        <w:tblLook w:firstRow="1" w:lastRow="0" w:firstColumn="0" w:lastColumn="0" w:noHBand="0" w:noVBand="0" w:val="0020"/>
+        <w:jc w:val="start"/>
+      </w:tblPr>
+      <w:tblGrid>
+        <w:gridCol w:w="3960"/>
+        <w:gridCol w:w="3960"/>
+      </w:tblGrid>
+      <w:tr>
+        <w:trPr>
+          <w:tblHeader w:val="true"/>
+        </w:trPr>
+        <w:tc>
+          <w:tcPr/>
+          <w:p>
+            <w:pPr>
+              <w:pStyle w:val="Compact"/>
+              <w:jc w:val="left"/>
+            </w:pPr>
+            <w:r>
+              <w:t xml:space="preserve">If you mainly want…</w:t>
+            </w:r>
+          </w:p>
+        </w:tc>
+        <w:tc>
+          <w:tcPr/>
+          <w:p>
+            <w:pPr>
+              <w:pStyle w:val="Compact"/>
+              <w:jc w:val="left"/>
+            </w:pPr>
+            <w:r>
+              <w:t xml:space="preserve">Bookmark this</w:t>
+            </w:r>
+          </w:p>
+        </w:tc>
+      </w:tr>
+      <w:tr>
+        <w:tc>
+          <w:tcPr/>
+          <w:p>
+            <w:pPr>
+              <w:pStyle w:val="Compact"/>
+              <w:jc w:val="left"/>
+            </w:pPr>
+            <w:r>
+              <w:rPr>
+                <w:bCs/>
+                <w:b/>
+              </w:rPr>
+              <w:t xml:space="preserve">Sit, focus, name</w:t>
+            </w:r>
+          </w:p>
+        </w:tc>
+        <w:tc>
+          <w:tcPr/>
+          <w:p>
+            <w:pPr>
+              <w:pStyle w:val="Compact"/>
+              <w:jc w:val="left"/>
+            </w:pPr>
+            <w:r>
+              <w:t xml:space="preserve">Chapter 7</w:t>
+            </w:r>
+          </w:p>
+        </w:tc>
+      </w:tr>
+      <w:tr>
+        <w:tc>
+          <w:tcPr/>
+          <w:p>
+            <w:pPr>
+              <w:pStyle w:val="Compact"/>
+              <w:jc w:val="left"/>
+            </w:pPr>
+            <w:r>
+              <w:rPr>
+                <w:bCs/>
+                <w:b/>
+              </w:rPr>
+              <w:t xml:space="preserve">Calm at home / mat</w:t>
+            </w:r>
+          </w:p>
+        </w:tc>
+        <w:tc>
+          <w:tcPr/>
+          <w:p>
+            <w:pPr>
+              <w:pStyle w:val="Compact"/>
+              <w:jc w:val="left"/>
+            </w:pPr>
+            <w:r>
+              <w:t xml:space="preserve">Chapter 8</w:t>
+            </w:r>
+          </w:p>
+        </w:tc>
+      </w:tr>
+      <w:tr>
+        <w:tc>
+          <w:tcPr/>
+          <w:p>
+            <w:pPr>
+              <w:pStyle w:val="Compact"/>
+              <w:jc w:val="left"/>
+            </w:pPr>
+            <w:r>
+              <w:rPr>
+                <w:bCs/>
+                <w:b/>
+              </w:rPr>
+              <w:t xml:space="preserve">Come when called</w:t>
+            </w:r>
+          </w:p>
+        </w:tc>
+        <w:tc>
+          <w:tcPr/>
+          <w:p>
+            <w:pPr>
+              <w:pStyle w:val="Compact"/>
+              <w:jc w:val="left"/>
+            </w:pPr>
+            <w:r>
+              <w:t xml:space="preserve">Chapter 9</w:t>
+            </w:r>
+          </w:p>
+        </w:tc>
+      </w:tr>
+      <w:tr>
+        <w:tc>
+          <w:tcPr/>
+          <w:p>
+            <w:pPr>
+              <w:pStyle w:val="Compact"/>
+              <w:jc w:val="left"/>
+            </w:pPr>
+            <w:r>
+              <w:rPr>
+                <w:bCs/>
+                <w:b/>
+              </w:rPr>
+              <w:t xml:space="preserve">Walk nicely on lead</w:t>
+            </w:r>
+          </w:p>
+        </w:tc>
+        <w:tc>
+          <w:tcPr/>
+          <w:p>
+            <w:pPr>
+              <w:pStyle w:val="Compact"/>
+              <w:jc w:val="left"/>
+            </w:pPr>
+            <w:r>
+              <w:t xml:space="preserve">Chapter 10</w:t>
+            </w:r>
+          </w:p>
+        </w:tc>
+      </w:tr>
+      <w:tr>
+        <w:tc>
+          <w:tcPr/>
+          <w:p>
+            <w:pPr>
+              <w:pStyle w:val="Compact"/>
+              <w:jc w:val="left"/>
+            </w:pPr>
+            <w:r>
+              <w:rPr>
+                <w:bCs/>
+                <w:b/>
+              </w:rPr>
+              <w:t xml:space="preserve">Door / visitors</w:t>
+            </w:r>
+          </w:p>
+        </w:tc>
+        <w:tc>
+          <w:tcPr/>
+          <w:p>
+            <w:pPr>
+              <w:pStyle w:val="Compact"/>
+              <w:jc w:val="left"/>
+            </w:pPr>
+            <w:r>
+              <w:t xml:space="preserve">Chapter 11</w:t>
+            </w:r>
+          </w:p>
+        </w:tc>
+      </w:tr>
+      <w:tr>
+        <w:tc>
+          <w:tcPr/>
+          <w:p>
+            <w:pPr>
+              <w:pStyle w:val="Compact"/>
+              <w:jc w:val="left"/>
+            </w:pPr>
+            <w:r>
+              <w:rPr>
+                <w:bCs/>
+                <w:b/>
+              </w:rPr>
+              <w:t xml:space="preserve">Scared or stressed dog</w:t>
+            </w:r>
+          </w:p>
+        </w:tc>
+        <w:tc>
+          <w:tcPr/>
+          <w:p>
+            <w:pPr>
+              <w:pStyle w:val="Compact"/>
+              <w:jc w:val="left"/>
+            </w:pPr>
+            <w:r>
+              <w:t xml:space="preserve">Chapter 12 (read before heavy outdoor work)</w:t>
+            </w:r>
+          </w:p>
+        </w:tc>
+      </w:tr>
+      <w:tr>
+        <w:tc>
+          <w:tcPr/>
+          <w:p>
+            <w:pPr>
+              <w:pStyle w:val="Compact"/>
+              <w:jc w:val="left"/>
+            </w:pPr>
+            <w:r>
+              <w:rPr>
+                <w:bCs/>
+                <w:b/>
+              </w:rPr>
+              <w:t xml:space="preserve">Puppy / teenager / rescue</w:t>
+            </w:r>
+          </w:p>
+        </w:tc>
+        <w:tc>
+          <w:tcPr/>
+          <w:p>
+            <w:pPr>
+              <w:pStyle w:val="Compact"/>
+              <w:jc w:val="left"/>
+            </w:pPr>
+            <w:r>
+              <w:t xml:space="preserve">Chapter 13</w:t>
+            </w:r>
+          </w:p>
+        </w:tc>
+      </w:tr>
+      <w:tr>
+        <w:tc>
+          <w:tcPr/>
+          <w:p>
+            <w:pPr>
+              <w:pStyle w:val="Compact"/>
+              <w:jc w:val="left"/>
+            </w:pPr>
+            <w:r>
+              <w:rPr>
+                <w:bCs/>
+                <w:b/>
+              </w:rPr>
+              <w:t xml:space="preserve">Everything fell apart</w:t>
+            </w:r>
+          </w:p>
+        </w:tc>
+        <w:tc>
+          <w:tcPr/>
+          <w:p>
+            <w:pPr>
+              <w:pStyle w:val="Compact"/>
+              <w:jc w:val="left"/>
+            </w:pPr>
+            <w:r>
+              <w:t xml:space="preserve">Chapter 14</w:t>
+            </w:r>
+          </w:p>
+        </w:tc>
+      </w:tr>
+    </w:tbl>
+    <w:p>
+      <w:pPr>
+        <w:pStyle w:val="BodyText"/>
+      </w:pPr>
+      <w:r>
+        <w:t xml:space="preserve">If you</w:t>
+      </w:r>
+      <w:r>
+        <w:t xml:space="preserve"> </w:t>
+      </w:r>
+      <w:r>
+        <w:rPr>
+          <w:iCs/>
+          <w:i/>
+        </w:rPr>
+        <w:t xml:space="preserve">do</w:t>
+      </w:r>
+      <w:r>
+        <w:t xml:space="preserve"> </w:t>
+      </w:r>
+      <w:r>
+        <w:t xml:space="preserve">read in order: Chapters 1–3 get you oriented. Chapters 4–6 teach the</w:t>
+      </w:r>
+      <w:r>
+        <w:t xml:space="preserve"> </w:t>
+      </w:r>
+      <w:r>
+        <w:rPr>
+          <w:bCs/>
+          <w:b/>
+        </w:rPr>
+        <w:t xml:space="preserve">how</w:t>
+      </w:r>
+      <w:r>
+        <w:t xml:space="preserve">.</w:t>
+      </w:r>
+      <w:r>
+        <w:t xml:space="preserve"> </w:t>
+      </w:r>
+      <w:r>
+        <w:rPr>
+          <w:bCs/>
+          <w:b/>
+        </w:rPr>
         <w:t xml:space="preserve">Chapter 12</w:t>
       </w:r>
       <w:r>
         <w:t xml:space="preserve"> </w:t>
       </w:r>
       <w:r>
-        <w:t xml:space="preserve">— comfort and stress</w:t>
-      </w:r>
-      <w:r>
-        <w:t xml:space="preserve"> </w:t>
-      </w:r>
-      <w:r>
-        <w:rPr>
-          <w:bCs/>
-          <w:b/>
-        </w:rPr>
-        <w:t xml:space="preserve">before</w:t>
-      </w:r>
-      <w:r>
-        <w:t xml:space="preserve"> </w:t>
-      </w:r>
-      <w:r>
-        <w:t xml:space="preserve">recall, lead, and door skills in Part III.</w:t>
-      </w:r>
-      <w:r>
-        <w:br/>
-      </w:r>
-    </w:p>
-    <w:p>
-      <w:pPr>
-        <w:numPr>
-          <w:ilvl w:val="0"/>
-          <w:numId w:val="1011"/>
-        </w:numPr>
-        <w:pStyle w:val="Compact"/>
-      </w:pPr>
-      <w:r>
-        <w:rPr>
-          <w:bCs/>
-          <w:b/>
-        </w:rPr>
-        <w:t xml:space="preserve">Part III (Chapters 7–11)</w:t>
-      </w:r>
-      <w:r>
-        <w:t xml:space="preserve"> </w:t>
-      </w:r>
-      <w:r>
-        <w:t xml:space="preserve">— live skills with practice labs. Each chapter runs the same system.</w:t>
-      </w:r>
-      <w:r>
-        <w:br/>
-      </w:r>
-    </w:p>
-    <w:p>
-      <w:pPr>
-        <w:numPr>
-          <w:ilvl w:val="0"/>
-          <w:numId w:val="1011"/>
-        </w:numPr>
-        <w:pStyle w:val="Compact"/>
-      </w:pPr>
-      <w:r>
-        <w:rPr>
-          <w:bCs/>
-          <w:b/>
-        </w:rPr>
-        <w:t xml:space="preserve">Chapter 14</w:t>
-      </w:r>
-      <w:r>
-        <w:t xml:space="preserve"> </w:t>
-      </w:r>
-      <w:r>
-        <w:t xml:space="preserve">— full five-check troubleshooting and when to call for help.</w:t>
-      </w:r>
-    </w:p>
-    <w:p>
-      <w:pPr>
-        <w:pStyle w:val="FirstParagraph"/>
-      </w:pPr>
-      <w:r>
-        <w:rPr>
-          <w:bCs/>
-          <w:b/>
-        </w:rPr>
-        <w:t xml:space="preserve">If you are worried about something specific:</w:t>
+        <w:t xml:space="preserve">before big outdoor skills (come, lead, door). Then Chapters 7–11 for the basics in real life.</w:t>
+      </w:r>
+    </w:p>
+    <w:p>
+      <w:pPr>
+        <w:pStyle w:val="BodyText"/>
+      </w:pPr>
+      <w:r>
+        <w:rPr>
+          <w:bCs/>
+          <w:b/>
+        </w:rPr>
+        <w:t xml:space="preserve">Worried shortcuts:</w:t>
       </w:r>
     </w:p>
     <w:p>
@@ -3083,41 +3070,13 @@
           <w:bCs/>
           <w:b/>
         </w:rPr>
-        <w:t xml:space="preserve">Fear on walks, freezes,</w:t>
-      </w:r>
-      <w:r>
-        <w:rPr>
-          <w:bCs/>
-          <w:b/>
-        </w:rPr>
-        <w:t xml:space="preserve"> </w:t>
-      </w:r>
-      <w:r>
-        <w:rPr>
-          <w:bCs/>
-          <w:b/>
-        </w:rPr>
-        <w:t xml:space="preserve">“</w:t>
-      </w:r>
-      <w:r>
-        <w:rPr>
-          <w:bCs/>
-          <w:b/>
-        </w:rPr>
-        <w:t xml:space="preserve">won’t go</w:t>
-      </w:r>
-      <w:r>
-        <w:rPr>
-          <w:bCs/>
-          <w:b/>
-        </w:rPr>
-        <w:t xml:space="preserve">”</w:t>
-      </w:r>
-      <w:r>
-        <w:t xml:space="preserve"> </w:t>
-      </w:r>
-      <w:r>
-        <w:t xml:space="preserve">→ start with Chapter 12, then back to skills when ready.</w:t>
+        <w:t xml:space="preserve">Afraid on walks</w:t>
+      </w:r>
+      <w:r>
+        <w:t xml:space="preserve"> </w:t>
+      </w:r>
+      <w:r>
+        <w:t xml:space="preserve">→ Chapter 12 first.</w:t>
       </w:r>
       <w:r>
         <w:br/>
@@ -3136,26 +3095,39 @@
           <w:bCs/>
           <w:b/>
         </w:rPr>
-        <w:t xml:space="preserve">Recall in distractions</w:t>
-      </w:r>
-      <w:r>
-        <w:t xml:space="preserve"> </w:t>
-      </w:r>
-      <w:r>
-        <w:t xml:space="preserve">→ foundations in Chapters 7–8,</w:t>
-      </w:r>
-      <w:r>
-        <w:t xml:space="preserve"> </w:t>
-      </w:r>
-      <w:r>
-        <w:rPr>
-          <w:bCs/>
-          <w:b/>
-        </w:rPr>
-        <w:t xml:space="preserve">Chapter 12</w:t>
-      </w:r>
-      <w:r>
-        <w:t xml:space="preserve">, then Chapter 9.</w:t>
+        <w:t xml:space="preserve">Come fails outside</w:t>
+      </w:r>
+      <w:r>
+        <w:t xml:space="preserve"> </w:t>
+      </w:r>
+      <w:r>
+        <w:t xml:space="preserve">→ Chapters 7–8, then</w:t>
+      </w:r>
+      <w:r>
+        <w:t xml:space="preserve"> </w:t>
+      </w:r>
+      <w:r>
+        <w:rPr>
+          <w:bCs/>
+          <w:b/>
+        </w:rPr>
+        <w:t xml:space="preserve">12</w:t>
+      </w:r>
+      <w:r>
+        <w:t xml:space="preserve">, then</w:t>
+      </w:r>
+      <w:r>
+        <w:t xml:space="preserve"> </w:t>
+      </w:r>
+      <w:r>
+        <w:rPr>
+          <w:bCs/>
+          <w:b/>
+        </w:rPr>
+        <w:t xml:space="preserve">9</w:t>
+      </w:r>
+      <w:r>
+        <w:t xml:space="preserve">.</w:t>
       </w:r>
       <w:r>
         <w:br/>
@@ -3174,13 +3146,13 @@
           <w:bCs/>
           <w:b/>
         </w:rPr>
-        <w:t xml:space="preserve">Stuck, grumpy, everything fell apart</w:t>
-      </w:r>
-      <w:r>
-        <w:t xml:space="preserve"> </w:t>
-      </w:r>
-      <w:r>
-        <w:t xml:space="preserve">→ Chapter 14 and the mantra:</w:t>
+        <w:t xml:space="preserve">Grumpy, stuck, lost</w:t>
+      </w:r>
+      <w:r>
+        <w:t xml:space="preserve"> </w:t>
+      </w:r>
+      <w:r>
+        <w:t xml:space="preserve">→ Chapter 14 and</w:t>
       </w:r>
       <w:r>
         <w:t xml:space="preserve"> </w:t>
@@ -3198,12 +3170,6 @@
         <w:pStyle w:val="FirstParagraph"/>
       </w:pPr>
       <w:r>
-        <w:t xml:space="preserve">One chapter at a time.</w:t>
-      </w:r>
-      <w:r>
-        <w:t xml:space="preserve"> </w:t>
-      </w:r>
-      <w:r>
         <w:rPr>
           <w:bCs/>
           <w:b/>
@@ -3214,7 +3180,23 @@
         <w:t xml:space="preserve"> </w:t>
       </w:r>
       <w:r>
-        <w:t xml:space="preserve">Trust the order inside.</w:t>
+        <w:t xml:space="preserve">One chapter at a time is fine.</w:t>
+      </w:r>
+      <w:r>
+        <w:t xml:space="preserve"> </w:t>
+      </w:r>
+      <w:r>
+        <w:rPr>
+          <w:bCs/>
+          <w:b/>
+        </w:rPr>
+        <w:t xml:space="preserve">Basics first</w:t>
+      </w:r>
+      <w:r>
+        <w:t xml:space="preserve"> </w:t>
+      </w:r>
+      <w:r>
+        <w:t xml:space="preserve">is fine.</w:t>
       </w:r>
     </w:p>
     <w:p>
@@ -3232,7 +3214,7 @@
         <w:t xml:space="preserve"> </w:t>
       </w:r>
       <w:r>
-        <w:t xml:space="preserve">plain language, reward-based methods, honest limits, and repeated permission to</w:t>
+        <w:t xml:space="preserve">plain language, kind methods, honest limits, permission to</w:t>
       </w:r>
       <w:r>
         <w:t xml:space="preserve"> </w:t>
@@ -3266,7 +3248,7 @@
         <w:t xml:space="preserve"> </w:t>
       </w:r>
       <w:r>
-        <w:t xml:space="preserve">instant fixes, a dog who ignores biology, or a life free of vets and professionals when things are serious.</w:t>
+        <w:t xml:space="preserve">a perfect dog, instant fixes, or that you never need a vet or professional when things are serious.</w:t>
       </w:r>
     </w:p>
     <w:bookmarkEnd w:id="48"/>
@@ -3326,20 +3308,7 @@
         <w:t xml:space="preserve"> </w:t>
       </w:r>
       <w:r>
-        <w:t xml:space="preserve">→ You are still the hero of the story. We are targeting</w:t>
-      </w:r>
-      <w:r>
-        <w:t xml:space="preserve"> </w:t>
-      </w:r>
-      <w:r>
-        <w:rPr>
-          <w:bCs/>
-          <w:b/>
-        </w:rPr>
-        <w:t xml:space="preserve">habits</w:t>
-      </w:r>
-      <w:r>
-        <w:t xml:space="preserve">, not your worth. Re-read §2 and the four doors.</w:t>
+        <w:t xml:space="preserve">→ We mean habits, not your worth. Re-read §2.</w:t>
       </w:r>
       <w:r>
         <w:br/>
@@ -3358,13 +3327,13 @@
           <w:bCs/>
           <w:b/>
         </w:rPr>
-        <w:t xml:space="preserve">If you want a command list right now</w:t>
-      </w:r>
-      <w:r>
-        <w:t xml:space="preserve"> </w:t>
-      </w:r>
-      <w:r>
-        <w:t xml:space="preserve">→ Part II is coming. Skipping the system is how people end up repeating cues louder.</w:t>
+        <w:t xml:space="preserve">If you only want sit, come, walk nicely</w:t>
+      </w:r>
+      <w:r>
+        <w:t xml:space="preserve"> </w:t>
+      </w:r>
+      <w:r>
+        <w:t xml:space="preserve">→ Good. Bookmark 7, 9, and 10. Skim the rest when you need it.</w:t>
       </w:r>
       <w:r>
         <w:br/>
@@ -3389,7 +3358,7 @@
         <w:t xml:space="preserve"> </w:t>
       </w:r>
       <w:r>
-        <w:t xml:space="preserve">→ This chapter is not the fix. Manage safety. See Chapters 12 and 14. Call a qualified professional and/or your vet.</w:t>
+        <w:t xml:space="preserve">→ This chapter is not the fix. Keep everyone safe. See Chapters 12 and 14. Call your vet and/or a qualified professional.</w:t>
       </w:r>
     </w:p>
     <w:bookmarkEnd w:id="49"/>
@@ -3424,12 +3393,6 @@
         <w:t xml:space="preserve">Stop.</w:t>
       </w:r>
       <w:r>
-        <w:t xml:space="preserve"> </w:t>
-      </w:r>
-      <w:r>
-        <w:t xml:space="preserve">No training beat is worth that.</w:t>
-      </w:r>
-      <w:r>
         <w:br/>
       </w:r>
     </w:p>
@@ -3442,7 +3405,7 @@
         <w:pStyle w:val="Compact"/>
       </w:pPr>
       <w:r>
-        <w:t xml:space="preserve">You are training to vent. Walk away. Water. Human snack. Try tomorrow.</w:t>
+        <w:t xml:space="preserve">You are training to vent. Walk away. Water. Snack. Tomorrow.</w:t>
       </w:r>
       <w:r>
         <w:br/>
@@ -3469,12 +3432,6 @@
         </w:rPr>
         <w:t xml:space="preserve">Vet first.</w:t>
       </w:r>
-      <w:r>
-        <w:t xml:space="preserve"> </w:t>
-      </w:r>
-      <w:r>
-        <w:t xml:space="preserve">Training second.</w:t>
-      </w:r>
     </w:p>
     <w:bookmarkEnd w:id="50"/>
     <w:bookmarkStart w:id="51" w:name="before-the-next-chapter"/>
@@ -3491,7 +3448,7 @@
         <w:pStyle w:val="FirstParagraph"/>
       </w:pPr>
       <w:r>
-        <w:t xml:space="preserve">Chapter 2 is how dogs actually learn — consequences, timing, and why</w:t>
+        <w:t xml:space="preserve">Chapter 2 is how dogs actually learn — in plain words, why</w:t>
       </w:r>
       <w:r>
         <w:t xml:space="preserve"> </w:t>
@@ -3509,23 +3466,7 @@
         <w:t xml:space="preserve"> </w:t>
       </w:r>
       <w:r>
-        <w:t xml:space="preserve">is the wrong story. You already met the system. Next we fill in</w:t>
-      </w:r>
-      <w:r>
-        <w:t xml:space="preserve"> </w:t>
-      </w:r>
-      <w:r>
-        <w:rPr>
-          <w:bCs/>
-          <w:b/>
-        </w:rPr>
-        <w:t xml:space="preserve">why dogs care about payoffs at all.</w:t>
-      </w:r>
-      <w:r>
-        <w:t xml:space="preserve"> </w:t>
-      </w:r>
-      <w:r>
-        <w:t xml:space="preserve">Bring your kitchen and your mud.</w:t>
+        <w:t xml:space="preserve">is usually the wrong story. Bring your kitchen and your mud.</w:t>
       </w:r>
     </w:p>
     <w:p>
@@ -3954,7 +3895,34 @@
     </w:lvlOverride>
   </w:num>
   <w:num w:numId="1009">
-    <w:abstractNumId w:val="991"/>
+    <w:abstractNumId w:val="99411"/>
+    <w:lvlOverride w:ilvl="0">
+      <w:startOverride w:val="1"/>
+    </w:lvlOverride>
+    <w:lvlOverride w:ilvl="1">
+      <w:startOverride w:val="1"/>
+    </w:lvlOverride>
+    <w:lvlOverride w:ilvl="2">
+      <w:startOverride w:val="1"/>
+    </w:lvlOverride>
+    <w:lvlOverride w:ilvl="3">
+      <w:startOverride w:val="1"/>
+    </w:lvlOverride>
+    <w:lvlOverride w:ilvl="4">
+      <w:startOverride w:val="1"/>
+    </w:lvlOverride>
+    <w:lvlOverride w:ilvl="5">
+      <w:startOverride w:val="1"/>
+    </w:lvlOverride>
+    <w:lvlOverride w:ilvl="6">
+      <w:startOverride w:val="1"/>
+    </w:lvlOverride>
+    <w:lvlOverride w:ilvl="7">
+      <w:startOverride w:val="1"/>
+    </w:lvlOverride>
+    <w:lvlOverride w:ilvl="8">
+      <w:startOverride w:val="1"/>
+    </w:lvlOverride>
   </w:num>
   <w:num w:numId="1010">
     <w:abstractNumId w:val="991"/>

</xml_diff>

<commit_message>
Complete tone P2: prevention gloss, further reading, ch01 slice export
- Add writing/FURTHER_READING.md; ch01 pointer and ch14 optional list
- Reader-facing management → prevention in ch03, ch08–11, ch13–14
- Fix ch11 choice markdown; ch14 dual-track capitalisation
- Regenerate ch01 trainer review v2 DOCX; update STATUS and tone audit

Co-authored-by: GeneralKnowledge <GeneralKnowledge@users.noreply.github.com>
</commit_message>
<xml_diff>
--- a/export/review-slices/Good-Dog-Ch01-Trainer-Review-Slice-v2.docx
+++ b/export/review-slices/Good-Dog-Ch01-Trainer-Review-Slice-v2.docx
@@ -483,7 +483,7 @@
     </w:p>
     <w:bookmarkEnd w:id="26"/>
     <w:bookmarkEnd w:id="27"/>
-    <w:bookmarkStart w:id="42" w:name="X4babf4e8d22d21de8d29b8b45e720ff64a92280"/>
+    <w:bookmarkStart w:id="43" w:name="X4babf4e8d22d21de8d29b8b45e720ff64a92280"/>
     <w:p>
       <w:pPr>
         <w:pStyle w:val="Heading1"/>
@@ -2511,6 +2511,53 @@
         <w:t xml:space="preserve">a perfect dog, instant fixes, or that you never need a vet or professional when things are serious.</w:t>
       </w:r>
     </w:p>
+    <w:p>
+      <w:pPr>
+        <w:pStyle w:val="BodyText"/>
+      </w:pPr>
+      <w:r>
+        <w:rPr>
+          <w:bCs/>
+          <w:b/>
+        </w:rPr>
+        <w:t xml:space="preserve">Another book on the shelf?</w:t>
+      </w:r>
+      <w:r>
+        <w:t xml:space="preserve"> </w:t>
+      </w:r>
+      <w:r>
+        <w:t xml:space="preserve">Optional UK further reading — Dogs Trust articles, ABTC signposts, and puppy-friendly guides such as Steve Mann’s</w:t>
+      </w:r>
+      <w:r>
+        <w:t xml:space="preserve"> </w:t>
+      </w:r>
+      <w:r>
+        <w:rPr>
+          <w:iCs/>
+          <w:i/>
+        </w:rPr>
+        <w:t xml:space="preserve">Easy Peasy Puppy Squeezy</w:t>
+      </w:r>
+      <w:r>
+        <w:t xml:space="preserve"> </w:t>
+      </w:r>
+      <w:r>
+        <w:t xml:space="preserve">if that voice suits you — lives in</w:t>
+      </w:r>
+      <w:r>
+        <w:t xml:space="preserve"> </w:t>
+      </w:r>
+      <w:r>
+        <w:rPr>
+          <w:bCs/>
+          <w:b/>
+        </w:rPr>
+        <w:t xml:space="preserve">Chapter 14</w:t>
+      </w:r>
+      <w:r>
+        <w:t xml:space="preserve">. Nothing here replaces your vet or a qualified behaviourist when safety or welfare is on the line.</w:t>
+      </w:r>
+    </w:p>
     <w:bookmarkEnd w:id="38"/>
     <w:bookmarkStart w:id="39" w:name="troubleshooting"/>
     <w:p>
@@ -2703,9 +2750,11 @@
         <w:t xml:space="preserve">Before the next chapter</w:t>
       </w:r>
     </w:p>
-    <w:p>
-      <w:pPr>
-        <w:pStyle w:val="FirstParagraph"/>
+    <w:bookmarkEnd w:id="41"/>
+    <w:bookmarkStart w:id="42" w:name="X321ac37440c65914d66512429895e9dab760a5d"/>
+    <w:p>
+      <w:pPr>
+        <w:pStyle w:val="Heading2"/>
       </w:pPr>
       <w:r>
         <w:t xml:space="preserve">Chapter 2 is how dogs actually learn — in plain words, why</w:t>
@@ -2727,13 +2776,6 @@
       </w:r>
       <w:r>
         <w:t xml:space="preserve">is usually the wrong story. You already met the human half. Bring your kitchen and your mud.</w:t>
-      </w:r>
-    </w:p>
-    <w:p>
-      <w:r>
-        <w:pict>
-          <v:rect style="width:0;height:1.5pt" o:hralign="center" o:hrstd="t" o:hr="t"/>
-        </w:pict>
       </w:r>
     </w:p>
     <w:p>
@@ -2748,8 +2790,8 @@
         <w:t xml:space="preserve">End of review slice v2.</w:t>
       </w:r>
     </w:p>
-    <w:bookmarkEnd w:id="41"/>
     <w:bookmarkEnd w:id="42"/>
+    <w:bookmarkEnd w:id="43"/>
     <w:sectPr/>
   </w:body>
 </w:document>

</xml_diff>